<commit_message>
Regenerate v1.1.0 manuals and documentation validation
- Quick Start and User Manual rebuilt (MD/DOCX/PDF) from the v1.1.0 code with fresh
  desktop and browser screenshots (bundled synthetic data only).
- Figure presets: worked dataset A -> preset -> dataset B example and the categorical
  colour behaviour after applying a preset.
- PDF cover/footer use DejaVu Sans so the em-dash renders (Helvetica base font lacked
  the glyph).
- scripts/validate_documented_workflows.py executes the documented workflows through the
  shared controller/core path (load/map/render/export in 5 formats, statistics, presets
  across datasets, multi-sheet workbook, matrix workflow, Figure Builder, recommendations)
  -> docs/manuals/audit/v1.1.0_documentation_validation.csv (8/8 PASS); manual
  instruction validation re-run (22/22 PASS).
- Screenshot capture no longer writes the About text (contained a local commit lookup).
- docs/RELEASE_NOTES_v1.1.0.md; ignore the manual PDF build cache.
</commit_message>
<xml_diff>
--- a/docs/manuals/Quick_Start/MakeMyFigure_Quick_Start.docx
+++ b/docs/manuals/Quick_Start/MakeMyFigure_Quick_Start.docx
@@ -52,7 +52,7 @@
         <w:t xml:space="preserve"> </w:t>
       </w:r>
       <w:r>
-        <w:t xml:space="preserve">1.0.0</w:t>
+        <w:t xml:space="preserve">1.1.0</w:t>
       </w:r>
       <w:r>
         <w:br/>
@@ -70,7 +70,7 @@
         <w:rPr>
           <w:rStyle w:val="VerbatimChar"/>
         </w:rPr>
-        <w:t xml:space="preserve">ac49ff8</w:t>
+        <w:t xml:space="preserve">cea315c</w:t>
       </w:r>
       <w:r>
         <w:br/>
@@ -85,7 +85,7 @@
         <w:t xml:space="preserve"> </w:t>
       </w:r>
       <w:r>
-        <w:t xml:space="preserve">2026-09-03</w:t>
+        <w:t xml:space="preserve">2026-09-06</w:t>
       </w:r>
     </w:p>
     <w:p>
@@ -464,31 +464,421 @@
         <w:pStyle w:val="FirstParagraph"/>
       </w:pPr>
       <w:r>
-        <w:t xml:space="preserve">Installers for</w:t>
-      </w:r>
-      <w:r>
-        <w:t xml:space="preserve"> </w:t>
-      </w:r>
-      <w:r>
-        <w:rPr>
-          <w:b/>
-        </w:rPr>
-        <w:t xml:space="preserve">Windows</w:t>
-      </w:r>
-      <w:r>
-        <w:t xml:space="preserve"> </w:t>
-      </w:r>
-      <w:r>
-        <w:t xml:space="preserve">(</w:t>
-      </w:r>
+        <w:t xml:space="preserve">Download the installer for your system from the project’s GitHub</w:t>
+      </w:r>
+      <w:r>
+        <w:t xml:space="preserve"> </w:t>
+      </w:r>
+      <w:r>
+        <w:rPr>
+          <w:b/>
+        </w:rPr>
+        <w:t xml:space="preserve">Releases</w:t>
+      </w:r>
+      <w:r>
+        <w:t xml:space="preserve"> </w:t>
+      </w:r>
+      <w:r>
+        <w:t xml:space="preserve">page (release</w:t>
+      </w:r>
+      <w:r>
+        <w:t xml:space="preserve"> </w:t>
+      </w:r>
+      <w:r>
+        <w:rPr>
+          <w:b/>
+        </w:rPr>
+        <w:t xml:space="preserve">v1.1.0</w:t>
+      </w:r>
+      <w:r>
+        <w:t xml:space="preserve">):</w:t>
+      </w:r>
+    </w:p>
+    <w:tbl>
+      <w:tblPr>
+        <w:tblStyle w:val="Table"/>
+        <w:tblW w:type="pct" w:w="5000.0"/>
+        <w:tblLook w:firstRow="1"/>
+      </w:tblPr>
+      <w:tblGrid>
+        <w:gridCol w:w="2640"/>
+        <w:gridCol w:w="2640"/>
+        <w:gridCol w:w="2640"/>
+      </w:tblGrid>
+      <w:tr>
+        <w:trPr>
+          <w:cnfStyle w:firstRow="1"/>
+        </w:trPr>
+        <w:tc>
+          <w:tcPr>
+            <w:tcBorders>
+              <w:bottom w:val="single"/>
+            </w:tcBorders>
+            <w:vAlign w:val="bottom"/>
+          </w:tcPr>
+          <w:p>
+            <w:pPr>
+              <w:pStyle w:val="Compact"/>
+              <w:jc w:val="left"/>
+            </w:pPr>
+            <w:r>
+              <w:t xml:space="preserve">System</w:t>
+            </w:r>
+          </w:p>
+        </w:tc>
+        <w:tc>
+          <w:tcPr>
+            <w:tcBorders>
+              <w:bottom w:val="single"/>
+            </w:tcBorders>
+            <w:vAlign w:val="bottom"/>
+          </w:tcPr>
+          <w:p>
+            <w:pPr>
+              <w:pStyle w:val="Compact"/>
+              <w:jc w:val="left"/>
+            </w:pPr>
+            <w:r>
+              <w:t xml:space="preserve">File</w:t>
+            </w:r>
+          </w:p>
+        </w:tc>
+        <w:tc>
+          <w:tcPr>
+            <w:tcBorders>
+              <w:bottom w:val="single"/>
+            </w:tcBorders>
+            <w:vAlign w:val="bottom"/>
+          </w:tcPr>
+          <w:p>
+            <w:pPr>
+              <w:pStyle w:val="Compact"/>
+              <w:jc w:val="left"/>
+            </w:pPr>
+            <w:r>
+              <w:t xml:space="preserve">Steps</w:t>
+            </w:r>
+          </w:p>
+        </w:tc>
+      </w:tr>
+      <w:tr>
+        <w:tc>
+          <w:p>
+            <w:pPr>
+              <w:pStyle w:val="Compact"/>
+              <w:jc w:val="left"/>
+            </w:pPr>
+            <w:r>
+              <w:rPr>
+                <w:b/>
+              </w:rPr>
+              <w:t xml:space="preserve">macOS</w:t>
+            </w:r>
+          </w:p>
+        </w:tc>
+        <w:tc>
+          <w:p>
+            <w:pPr>
+              <w:pStyle w:val="Compact"/>
+              <w:jc w:val="left"/>
+            </w:pPr>
+            <w:r>
+              <w:rPr>
+                <w:rStyle w:val="VerbatimChar"/>
+              </w:rPr>
+              <w:t xml:space="preserve">MakeMyFigure-1.1.0.dmg</w:t>
+            </w:r>
+          </w:p>
+        </w:tc>
+        <w:tc>
+          <w:p>
+            <w:pPr>
+              <w:pStyle w:val="Compact"/>
+              <w:jc w:val="left"/>
+            </w:pPr>
+            <w:r>
+              <w:t xml:space="preserve">open the DMG, drag</w:t>
+            </w:r>
+            <w:r>
+              <w:t xml:space="preserve"> </w:t>
+            </w:r>
+            <w:r>
+              <w:rPr>
+                <w:i/>
+              </w:rPr>
+              <w:t xml:space="preserve">Make My Figure</w:t>
+            </w:r>
+            <w:r>
+              <w:t xml:space="preserve"> </w:t>
+            </w:r>
+            <w:r>
+              <w:t xml:space="preserve">to</w:t>
+            </w:r>
+            <w:r>
+              <w:t xml:space="preserve"> </w:t>
+            </w:r>
+            <w:r>
+              <w:rPr>
+                <w:i/>
+              </w:rPr>
+              <w:t xml:space="preserve">Applications</w:t>
+            </w:r>
+            <w:r>
+              <w:t xml:space="preserve">, launch it. The bundle is not notarised: on first launch right-click →</w:t>
+            </w:r>
+            <w:r>
+              <w:t xml:space="preserve"> </w:t>
+            </w:r>
+            <w:r>
+              <w:rPr>
+                <w:b/>
+              </w:rPr>
+              <w:t xml:space="preserve">Open</w:t>
+            </w:r>
+            <w:r>
+              <w:t xml:space="preserve"> </w:t>
+            </w:r>
+            <w:r>
+              <w:t xml:space="preserve">(or allow it under</w:t>
+            </w:r>
+            <w:r>
+              <w:t xml:space="preserve"> </w:t>
+            </w:r>
+            <w:r>
+              <w:rPr>
+                <w:i/>
+              </w:rPr>
+              <w:t xml:space="preserve">System Settings → Privacy &amp; Security</w:t>
+            </w:r>
+            <w:r>
+              <w:t xml:space="preserve">).</w:t>
+            </w:r>
+          </w:p>
+        </w:tc>
+      </w:tr>
+      <w:tr>
+        <w:tc>
+          <w:p>
+            <w:pPr>
+              <w:pStyle w:val="Compact"/>
+              <w:jc w:val="left"/>
+            </w:pPr>
+            <w:r>
+              <w:rPr>
+                <w:b/>
+              </w:rPr>
+              <w:t xml:space="preserve">Windows</w:t>
+            </w:r>
+          </w:p>
+        </w:tc>
+        <w:tc>
+          <w:p>
+            <w:pPr>
+              <w:pStyle w:val="Compact"/>
+              <w:jc w:val="left"/>
+            </w:pPr>
+            <w:r>
+              <w:rPr>
+                <w:rStyle w:val="VerbatimChar"/>
+              </w:rPr>
+              <w:t xml:space="preserve">MakeMyFigure-1.1.0-Setup.exe</w:t>
+            </w:r>
+            <w:r>
+              <w:t xml:space="preserve"> </w:t>
+            </w:r>
+            <w:r>
+              <w:t xml:space="preserve">(or</w:t>
+            </w:r>
+            <w:r>
+              <w:t xml:space="preserve"> </w:t>
+            </w:r>
+            <w:r>
+              <w:rPr>
+                <w:rStyle w:val="VerbatimChar"/>
+              </w:rPr>
+              <w:t xml:space="preserve">MakeMyFigure-1.1.0-windows.zip</w:t>
+            </w:r>
+            <w:r>
+              <w:t xml:space="preserve">)</w:t>
+            </w:r>
+          </w:p>
+        </w:tc>
+        <w:tc>
+          <w:p>
+            <w:pPr>
+              <w:pStyle w:val="Compact"/>
+              <w:jc w:val="left"/>
+            </w:pPr>
+            <w:r>
+              <w:t xml:space="preserve">run the installer (or unzip and start</w:t>
+            </w:r>
+            <w:r>
+              <w:t xml:space="preserve"> </w:t>
+            </w:r>
+            <w:r>
+              <w:rPr>
+                <w:rStyle w:val="VerbatimChar"/>
+              </w:rPr>
+              <w:t xml:space="preserve">MakeMyFigure\MakeMyFigure.exe</w:t>
+            </w:r>
+            <w:r>
+              <w:t xml:space="preserve">). SmartScreen may warn about an unsigned program; choose</w:t>
+            </w:r>
+            <w:r>
+              <w:t xml:space="preserve"> </w:t>
+            </w:r>
+            <w:r>
+              <w:rPr>
+                <w:i/>
+              </w:rPr>
+              <w:t xml:space="preserve">More info → Run anyway</w:t>
+            </w:r>
+            <w:r>
+              <w:t xml:space="preserve"> </w:t>
+            </w:r>
+            <w:r>
+              <w:t xml:space="preserve">if you trust the source.</w:t>
+            </w:r>
+          </w:p>
+        </w:tc>
+      </w:tr>
+      <w:tr>
+        <w:tc>
+          <w:p>
+            <w:pPr>
+              <w:pStyle w:val="Compact"/>
+              <w:jc w:val="left"/>
+            </w:pPr>
+            <w:r>
+              <w:rPr>
+                <w:b/>
+              </w:rPr>
+              <w:t xml:space="preserve">Linux</w:t>
+            </w:r>
+          </w:p>
+        </w:tc>
+        <w:tc>
+          <w:p>
+            <w:pPr>
+              <w:pStyle w:val="Compact"/>
+              <w:jc w:val="left"/>
+            </w:pPr>
+            <w:r>
+              <w:rPr>
+                <w:rStyle w:val="VerbatimChar"/>
+              </w:rPr>
+              <w:t xml:space="preserve">MakeMyFigure-1.1.0.AppImage</w:t>
+            </w:r>
+            <w:r>
+              <w:t xml:space="preserve"> </w:t>
+            </w:r>
+            <w:r>
+              <w:t xml:space="preserve">(or</w:t>
+            </w:r>
+            <w:r>
+              <w:t xml:space="preserve"> </w:t>
+            </w:r>
+            <w:r>
+              <w:rPr>
+                <w:rStyle w:val="VerbatimChar"/>
+              </w:rPr>
+              <w:t xml:space="preserve">MakeMyFigure-1.1.0-linux.tar.gz</w:t>
+            </w:r>
+            <w:r>
+              <w:t xml:space="preserve">)</w:t>
+            </w:r>
+          </w:p>
+        </w:tc>
+        <w:tc>
+          <w:p>
+            <w:pPr>
+              <w:pStyle w:val="Compact"/>
+              <w:jc w:val="left"/>
+            </w:pPr>
+            <w:r>
+              <w:rPr>
+                <w:rStyle w:val="VerbatimChar"/>
+              </w:rPr>
+              <w:t xml:space="preserve">chmod +x MakeMyFigure-1.1.0.AppImage &amp;&amp; ./MakeMyFigure-1.1.0.AppImage</w:t>
+            </w:r>
+            <w:r>
+              <w:t xml:space="preserve">, or unpack the tarball and run</w:t>
+            </w:r>
+            <w:r>
+              <w:t xml:space="preserve"> </w:t>
+            </w:r>
+            <w:r>
+              <w:rPr>
+                <w:rStyle w:val="VerbatimChar"/>
+              </w:rPr>
+              <w:t xml:space="preserve">MakeMyFigure/MakeMyFigure</w:t>
+            </w:r>
+            <w:r>
+              <w:t xml:space="preserve">.</w:t>
+            </w:r>
+          </w:p>
+        </w:tc>
+      </w:tr>
+      <w:tr>
+        <w:tc>
+          <w:p>
+            <w:pPr>
+              <w:pStyle w:val="Compact"/>
+              <w:jc w:val="left"/>
+            </w:pPr>
+            <w:r>
+              <w:rPr>
+                <w:b/>
+              </w:rPr>
+              <w:t xml:space="preserve">WSL2</w:t>
+            </w:r>
+            <w:r>
+              <w:t xml:space="preserve"> </w:t>
+            </w:r>
+            <w:r>
+              <w:t xml:space="preserve">(Linux under Windows)</w:t>
+            </w:r>
+          </w:p>
+        </w:tc>
+        <w:tc>
+          <w:p>
+            <w:pPr>
+              <w:pStyle w:val="Compact"/>
+              <w:jc w:val="left"/>
+            </w:pPr>
+            <w:r>
+              <w:t xml:space="preserve">not a native package</w:t>
+            </w:r>
+          </w:p>
+        </w:tc>
+        <w:tc>
+          <w:p>
+            <w:pPr>
+              <w:pStyle w:val="Compact"/>
+              <w:jc w:val="left"/>
+            </w:pPr>
+            <w:r>
+              <w:t xml:space="preserve">use the source install below with WSLg (Windows 11) or run the browser app and open it in a Windows browser.</w:t>
+            </w:r>
+          </w:p>
+        </w:tc>
+      </w:tr>
+    </w:tbl>
+    <w:p>
+      <w:pPr>
+        <w:pStyle w:val="BodyText"/>
+      </w:pPr>
       <w:r>
         <w:rPr>
           <w:rStyle w:val="VerbatimChar"/>
         </w:rPr>
-        <w:t xml:space="preserve">MakeMyFigure-Setup.exe</w:t>
-      </w:r>
-      <w:r>
-        <w:t xml:space="preserve">, or</w:t>
+        <w:t xml:space="preserve">SHA256SUMS.txt</w:t>
+      </w:r>
+      <w:r>
+        <w:t xml:space="preserve"> </w:t>
+      </w:r>
+      <w:r>
+        <w:t xml:space="preserve">on the release page lists the checksum of every file. The status bar (desktop) shows</w:t>
       </w:r>
       <w:r>
         <w:t xml:space="preserve"> </w:t>
@@ -497,270 +887,28 @@
         <w:rPr>
           <w:rStyle w:val="VerbatimChar"/>
         </w:rPr>
-        <w:t xml:space="preserve">MakeMyFigure-windows.zip</w:t>
-      </w:r>
-      <w:r>
-        <w:t xml:space="preserve">),</w:t>
-      </w:r>
-      <w:r>
-        <w:t xml:space="preserve"> </w:t>
-      </w:r>
-      <w:r>
-        <w:rPr>
-          <w:b/>
-        </w:rPr>
-        <w:t xml:space="preserve">macOS</w:t>
-      </w:r>
-      <w:r>
-        <w:t xml:space="preserve"> </w:t>
-      </w:r>
-      <w:r>
-        <w:t xml:space="preserve">(</w:t>
-      </w:r>
-      <w:r>
-        <w:rPr>
-          <w:rStyle w:val="VerbatimChar"/>
-        </w:rPr>
-        <w:t xml:space="preserve">MakeMyFigure.dmg</w:t>
-      </w:r>
-      <w:r>
-        <w:t xml:space="preserve">) and</w:t>
-      </w:r>
-      <w:r>
-        <w:t xml:space="preserve"> </w:t>
-      </w:r>
-      <w:r>
-        <w:rPr>
-          <w:b/>
-        </w:rPr>
-        <w:t xml:space="preserve">Linux</w:t>
-      </w:r>
-      <w:r>
-        <w:t xml:space="preserve"> </w:t>
-      </w:r>
-      <w:r>
-        <w:t xml:space="preserve">(</w:t>
-      </w:r>
-      <w:r>
-        <w:rPr>
-          <w:rStyle w:val="VerbatimChar"/>
-        </w:rPr>
-        <w:t xml:space="preserve">MakeMyFigure.AppImage</w:t>
-      </w:r>
-      <w:r>
-        <w:t xml:space="preserve">, or</w:t>
-      </w:r>
-      <w:r>
-        <w:t xml:space="preserve"> </w:t>
-      </w:r>
-      <w:r>
-        <w:rPr>
-          <w:rStyle w:val="VerbatimChar"/>
-        </w:rPr>
-        <w:t xml:space="preserve">MakeMyFigure-linux.tar.gz</w:t>
-      </w:r>
-      <w:r>
-        <w:t xml:space="preserve">) are attached to the GitHub release of version 1.0.0. They contain the desktop app and everything it needs.</w:t>
-      </w:r>
-    </w:p>
-    <w:p>
-      <w:pPr>
-        <w:pStyle w:val="BodyText"/>
-      </w:pPr>
-      <w:r>
-        <w:rPr>
-          <w:b/>
-        </w:rPr>
-        <w:t xml:space="preserve">Warning:</w:t>
-      </w:r>
-      <w:r>
-        <w:t xml:space="preserve"> </w:t>
-      </w:r>
-      <w:r>
-        <w:t xml:space="preserve">at the time of writing the published installers were built from the v1.0.0 release (July 2026). They do</w:t>
-      </w:r>
-      <w:r>
-        <w:t xml:space="preserve"> </w:t>
-      </w:r>
-      <w:r>
-        <w:rPr>
-          <w:b/>
-        </w:rPr>
-        <w:t xml:space="preserve">not</w:t>
-      </w:r>
-      <w:r>
-        <w:t xml:space="preserve"> </w:t>
-      </w:r>
-      <w:r>
-        <w:t xml:space="preserve">contain features added since — Figure presets, the histogram plot, the wide-form histogram picker, the collaborator fixes to survival curves and merged Excel headers. To use those today, install from source (B). A rebuilt installer will carry them once one is published.</w:t>
-      </w:r>
-    </w:p>
-    <w:p>
-      <w:pPr>
-        <w:numPr>
-          <w:ilvl w:val="0"/>
-          <w:numId w:val="1002"/>
-        </w:numPr>
-        <w:pStyle w:val="Compact"/>
-      </w:pPr>
-      <w:r>
-        <w:rPr>
-          <w:i/>
-        </w:rPr>
-        <w:t xml:space="preserve">Windows:</w:t>
-      </w:r>
-      <w:r>
-        <w:t xml:space="preserve"> </w:t>
-      </w:r>
-      <w:r>
-        <w:t xml:space="preserve">run the Setup</w:t>
-      </w:r>
-      <w:r>
-        <w:t xml:space="preserve"> </w:t>
-      </w:r>
-      <w:r>
-        <w:rPr>
-          <w:rStyle w:val="VerbatimChar"/>
-        </w:rPr>
-        <w:t xml:space="preserve">.exe</w:t>
-      </w:r>
-      <w:r>
-        <w:t xml:space="preserve"> </w:t>
-      </w:r>
-      <w:r>
-        <w:t xml:space="preserve">and follow the prompts, or unzip</w:t>
-      </w:r>
-      <w:r>
-        <w:t xml:space="preserve"> </w:t>
-      </w:r>
-      <w:r>
-        <w:rPr>
-          <w:rStyle w:val="VerbatimChar"/>
-        </w:rPr>
-        <w:t xml:space="preserve">MakeMyFigure-windows.zip</w:t>
-      </w:r>
-      <w:r>
-        <w:t xml:space="preserve"> </w:t>
-      </w:r>
-      <w:r>
-        <w:t xml:space="preserve">and run</w:t>
-      </w:r>
-      <w:r>
-        <w:t xml:space="preserve"> </w:t>
-      </w:r>
-      <w:r>
-        <w:rPr>
-          <w:rStyle w:val="VerbatimChar"/>
-        </w:rPr>
-        <w:t xml:space="preserve">MakeMyFigure\MakeMyFigure.exe</w:t>
-      </w:r>
-      <w:r>
-        <w:t xml:space="preserve">.</w:t>
-      </w:r>
-    </w:p>
-    <w:p>
-      <w:pPr>
-        <w:numPr>
-          <w:ilvl w:val="0"/>
-          <w:numId w:val="1002"/>
-        </w:numPr>
-        <w:pStyle w:val="Compact"/>
-      </w:pPr>
-      <w:r>
-        <w:rPr>
-          <w:i/>
-        </w:rPr>
-        <w:t xml:space="preserve">macOS:</w:t>
-      </w:r>
-      <w:r>
-        <w:t xml:space="preserve"> </w:t>
-      </w:r>
-      <w:r>
-        <w:t xml:space="preserve">open the</w:t>
-      </w:r>
-      <w:r>
-        <w:t xml:space="preserve"> </w:t>
-      </w:r>
-      <w:r>
-        <w:rPr>
-          <w:rStyle w:val="VerbatimChar"/>
-        </w:rPr>
-        <w:t xml:space="preserve">.dmg</w:t>
-      </w:r>
-      <w:r>
-        <w:t xml:space="preserve"> </w:t>
-      </w:r>
-      <w:r>
-        <w:t xml:space="preserve">and drag</w:t>
-      </w:r>
-      <w:r>
-        <w:t xml:space="preserve"> </w:t>
-      </w:r>
-      <w:r>
-        <w:rPr>
-          <w:b/>
-        </w:rPr>
-        <w:t xml:space="preserve">Make My Figure</w:t>
-      </w:r>
-      <w:r>
-        <w:t xml:space="preserve"> </w:t>
-      </w:r>
-      <w:r>
-        <w:t xml:space="preserve">to Applications. The first launch may need right-click →</w:t>
-      </w:r>
-      <w:r>
-        <w:t xml:space="preserve"> </w:t>
-      </w:r>
-      <w:r>
-        <w:rPr>
-          <w:b/>
-        </w:rPr>
-        <w:t xml:space="preserve">Open</w:t>
-      </w:r>
-      <w:r>
-        <w:t xml:space="preserve"> </w:t>
-      </w:r>
-      <w:r>
-        <w:t xml:space="preserve">because the bundle is not notarised.</w:t>
-      </w:r>
-    </w:p>
-    <w:p>
-      <w:pPr>
-        <w:numPr>
-          <w:ilvl w:val="0"/>
-          <w:numId w:val="1002"/>
-        </w:numPr>
-        <w:pStyle w:val="Compact"/>
-      </w:pPr>
-      <w:r>
-        <w:rPr>
-          <w:i/>
-        </w:rPr>
-        <w:t xml:space="preserve">Linux:</w:t>
-      </w:r>
-      <w:r>
-        <w:t xml:space="preserve"> </w:t>
-      </w:r>
-      <w:r>
-        <w:rPr>
-          <w:rStyle w:val="VerbatimChar"/>
-        </w:rPr>
-        <w:t xml:space="preserve">chmod +x MakeMyFigure.AppImage &amp;&amp; ./MakeMyFigure.AppImage</w:t>
-      </w:r>
-      <w:r>
-        <w:t xml:space="preserve">, or unpack the tarball and run</w:t>
-      </w:r>
-      <w:r>
-        <w:t xml:space="preserve"> </w:t>
-      </w:r>
-      <w:r>
-        <w:rPr>
-          <w:rStyle w:val="VerbatimChar"/>
-        </w:rPr>
-        <w:t xml:space="preserve">MakeMyFigure/MakeMyFigure</w:t>
-      </w:r>
-      <w:r>
-        <w:t xml:space="preserve">.</w:t>
+        <w:t xml:space="preserve">Make My Figure v1.1.0 · &lt;commit&gt; · &lt;platform&gt; · &lt;backend&gt;</w:t>
+      </w:r>
+      <w:r>
+        <w:t xml:space="preserve"> </w:t>
+      </w:r>
+      <w:r>
+        <w:t xml:space="preserve">on launch, and</w:t>
+      </w:r>
+      <w:r>
+        <w:t xml:space="preserve"> </w:t>
+      </w:r>
+      <w:r>
+        <w:rPr>
+          <w:b/>
+        </w:rPr>
+        <w:t xml:space="preserve">Help → About</w:t>
+      </w:r>
+      <w:r>
+        <w:t xml:space="preserve"> </w:t>
+      </w:r>
+      <w:r>
+        <w:t xml:space="preserve">shows the version.</w:t>
       </w:r>
     </w:p>
     <w:p>
@@ -1493,7 +1641,7 @@
       <w:pPr>
         <w:numPr>
           <w:ilvl w:val="0"/>
-          <w:numId w:val="1003"/>
+          <w:numId w:val="1002"/>
         </w:numPr>
         <w:pStyle w:val="Compact"/>
       </w:pPr>
@@ -1523,7 +1671,7 @@
       <w:pPr>
         <w:numPr>
           <w:ilvl w:val="0"/>
-          <w:numId w:val="1003"/>
+          <w:numId w:val="1002"/>
         </w:numPr>
         <w:pStyle w:val="Compact"/>
       </w:pPr>
@@ -1675,7 +1823,7 @@
       <w:r>
         <w:drawing>
           <wp:inline>
-            <wp:extent cx="5334000" cy="4224528"/>
+            <wp:extent cx="5334000" cy="9245600"/>
             <wp:effectExtent b="0" l="0" r="0" t="0"/>
             <wp:docPr descr="Browser app with the bundled example workbook: 40 worksheets listed, the selected sheet’s detected type, and the header-row selector." title="" id="1" name="Picture"/>
             <a:graphic>
@@ -1696,7 +1844,7 @@
                   <pic:spPr bwMode="auto">
                     <a:xfrm>
                       <a:off x="0" y="0"/>
-                      <a:ext cx="5334000" cy="4224528"/>
+                      <a:ext cx="5334000" cy="9245600"/>
                     </a:xfrm>
                     <a:prstGeom prst="rect">
                       <a:avLst/>
@@ -1842,7 +1990,7 @@
       <w:pPr>
         <w:numPr>
           <w:ilvl w:val="0"/>
-          <w:numId w:val="1004"/>
+          <w:numId w:val="1003"/>
         </w:numPr>
         <w:pStyle w:val="Compact"/>
       </w:pPr>
@@ -1905,7 +2053,7 @@
       <w:pPr>
         <w:numPr>
           <w:ilvl w:val="0"/>
-          <w:numId w:val="1004"/>
+          <w:numId w:val="1003"/>
         </w:numPr>
         <w:pStyle w:val="Compact"/>
       </w:pPr>
@@ -2001,7 +2149,7 @@
       <w:pPr>
         <w:numPr>
           <w:ilvl w:val="0"/>
-          <w:numId w:val="1004"/>
+          <w:numId w:val="1003"/>
         </w:numPr>
         <w:pStyle w:val="Compact"/>
       </w:pPr>
@@ -2094,7 +2242,7 @@
       <w:pPr>
         <w:numPr>
           <w:ilvl w:val="0"/>
-          <w:numId w:val="1004"/>
+          <w:numId w:val="1003"/>
         </w:numPr>
         <w:pStyle w:val="Compact"/>
       </w:pPr>
@@ -2106,7 +2254,7 @@
       <w:pPr>
         <w:numPr>
           <w:ilvl w:val="0"/>
-          <w:numId w:val="1004"/>
+          <w:numId w:val="1003"/>
         </w:numPr>
         <w:pStyle w:val="Compact"/>
       </w:pPr>
@@ -2154,7 +2302,7 @@
       <w:pPr>
         <w:numPr>
           <w:ilvl w:val="0"/>
-          <w:numId w:val="1004"/>
+          <w:numId w:val="1003"/>
         </w:numPr>
         <w:pStyle w:val="Compact"/>
       </w:pPr>
@@ -2230,7 +2378,7 @@
       <w:pPr>
         <w:numPr>
           <w:ilvl w:val="0"/>
-          <w:numId w:val="1005"/>
+          <w:numId w:val="1004"/>
         </w:numPr>
         <w:pStyle w:val="Compact"/>
       </w:pPr>
@@ -2444,7 +2592,7 @@
       <w:pPr>
         <w:numPr>
           <w:ilvl w:val="0"/>
-          <w:numId w:val="1006"/>
+          <w:numId w:val="1005"/>
         </w:numPr>
         <w:pStyle w:val="Compact"/>
       </w:pPr>
@@ -2504,6 +2652,137 @@
       </w:r>
       <w:r>
         <w:t xml:space="preserve">saves it as a panel.</w:t>
+      </w:r>
+    </w:p>
+    <w:p>
+      <w:pPr>
+        <w:numPr>
+          <w:ilvl w:val="0"/>
+          <w:numId w:val="1005"/>
+        </w:numPr>
+        <w:pStyle w:val="Compact"/>
+      </w:pPr>
+      <w:r>
+        <w:rPr>
+          <w:b/>
+        </w:rPr>
+        <w:t xml:space="preserve">Browser:</w:t>
+      </w:r>
+      <w:r>
+        <w:t xml:space="preserve"> </w:t>
+      </w:r>
+      <w:r>
+        <w:t xml:space="preserve">the</w:t>
+      </w:r>
+      <w:r>
+        <w:t xml:space="preserve"> </w:t>
+      </w:r>
+      <w:r>
+        <w:rPr>
+          <w:b/>
+        </w:rPr>
+        <w:t xml:space="preserve">🔮 Recommended figures</w:t>
+      </w:r>
+      <w:r>
+        <w:t xml:space="preserve"> </w:t>
+      </w:r>
+      <w:r>
+        <w:t xml:space="preserve">expander above the figure.</w:t>
+      </w:r>
+    </w:p>
+    <w:p>
+      <w:pPr>
+        <w:pStyle w:val="FirstParagraph"/>
+      </w:pPr>
+      <w:r>
+        <w:t xml:space="preserve">Recommendations are</w:t>
+      </w:r>
+      <w:r>
+        <w:t xml:space="preserve"> </w:t>
+      </w:r>
+      <w:r>
+        <w:rPr>
+          <w:b/>
+        </w:rPr>
+        <w:t xml:space="preserve">advisory</w:t>
+      </w:r>
+      <w:r>
+        <w:t xml:space="preserve">. The score is a rule-based heuristic on the table’s shape, not a measure of scientific appropriateness. You remain responsible for choosing what the figure should show.</w:t>
+      </w:r>
+    </w:p>
+    <w:p>
+      <w:pPr>
+        <w:pStyle w:val="Heading2"/>
+      </w:pPr>
+      <w:bookmarkStart w:id="37" w:name="run-statistics"/>
+      <w:r>
+        <w:t xml:space="preserve">7. Run statistics</w:t>
+      </w:r>
+      <w:bookmarkEnd w:id="37"/>
+    </w:p>
+    <w:p>
+      <w:pPr>
+        <w:pStyle w:val="FirstParagraph"/>
+      </w:pPr>
+      <w:r>
+        <w:t xml:space="preserve">Example:</w:t>
+      </w:r>
+      <w:r>
+        <w:t xml:space="preserve"> </w:t>
+      </w:r>
+      <w:r>
+        <w:rPr>
+          <w:b/>
+        </w:rPr>
+        <w:t xml:space="preserve">Box / violin plot with points</w:t>
+      </w:r>
+      <w:r>
+        <w:t xml:space="preserve"> </w:t>
+      </w:r>
+      <w:r>
+        <w:t xml:space="preserve">(bundled). In</w:t>
+      </w:r>
+      <w:r>
+        <w:t xml:space="preserve"> </w:t>
+      </w:r>
+      <w:r>
+        <w:rPr>
+          <w:b/>
+        </w:rPr>
+        <w:t xml:space="preserve">6. Statistics</w:t>
+      </w:r>
+      <w:r>
+        <w:t xml:space="preserve"> </w:t>
+      </w:r>
+      <w:r>
+        <w:t xml:space="preserve">(desktop: tick the group box, then</w:t>
+      </w:r>
+      <w:r>
+        <w:t xml:space="preserve"> </w:t>
+      </w:r>
+      <w:r>
+        <w:rPr>
+          <w:b/>
+        </w:rPr>
+        <w:t xml:space="preserve">Enable statistics</w:t>
+      </w:r>
+      <w:r>
+        <w:t xml:space="preserve">; browser:</w:t>
+      </w:r>
+      <w:r>
+        <w:t xml:space="preserve"> </w:t>
+      </w:r>
+      <w:r>
+        <w:rPr>
+          <w:b/>
+        </w:rPr>
+        <w:t xml:space="preserve">Statistical tests &amp; annotations</w:t>
+      </w:r>
+      <w:r>
+        <w:t xml:space="preserve"> </w:t>
+      </w:r>
+      <w:r>
+        <w:t xml:space="preserve">expander):</w:t>
       </w:r>
     </w:p>
     <w:p>
@@ -2518,130 +2797,44 @@
         <w:rPr>
           <w:b/>
         </w:rPr>
-        <w:t xml:space="preserve">Browser:</w:t>
-      </w:r>
-      <w:r>
-        <w:t xml:space="preserve"> </w:t>
-      </w:r>
-      <w:r>
-        <w:t xml:space="preserve">the</w:t>
-      </w:r>
-      <w:r>
-        <w:t xml:space="preserve"> </w:t>
-      </w:r>
-      <w:r>
-        <w:rPr>
-          <w:b/>
-        </w:rPr>
-        <w:t xml:space="preserve">🔮 Recommended figures</w:t>
-      </w:r>
-      <w:r>
-        <w:t xml:space="preserve"> </w:t>
-      </w:r>
-      <w:r>
-        <w:t xml:space="preserve">expander above the figure.</w:t>
-      </w:r>
-    </w:p>
-    <w:p>
-      <w:pPr>
-        <w:pStyle w:val="FirstParagraph"/>
-      </w:pPr>
-      <w:r>
-        <w:t xml:space="preserve">Recommendations are</w:t>
-      </w:r>
-      <w:r>
-        <w:t xml:space="preserve"> </w:t>
-      </w:r>
-      <w:r>
-        <w:rPr>
-          <w:b/>
-        </w:rPr>
-        <w:t xml:space="preserve">advisory</w:t>
-      </w:r>
-      <w:r>
-        <w:t xml:space="preserve">. The score is a rule-based heuristic on the table’s shape, not a measure of scientific appropriateness. You remain responsible for choosing what the figure should show.</w:t>
-      </w:r>
-    </w:p>
-    <w:p>
-      <w:pPr>
-        <w:pStyle w:val="Heading2"/>
-      </w:pPr>
-      <w:bookmarkStart w:id="37" w:name="run-statistics"/>
-      <w:r>
-        <w:t xml:space="preserve">7. Run statistics</w:t>
-      </w:r>
-      <w:bookmarkEnd w:id="37"/>
-    </w:p>
-    <w:p>
-      <w:pPr>
-        <w:pStyle w:val="FirstParagraph"/>
-      </w:pPr>
-      <w:r>
-        <w:t xml:space="preserve">Example:</w:t>
-      </w:r>
-      <w:r>
-        <w:t xml:space="preserve"> </w:t>
-      </w:r>
-      <w:r>
-        <w:rPr>
-          <w:b/>
-        </w:rPr>
-        <w:t xml:space="preserve">Box / violin plot with points</w:t>
-      </w:r>
-      <w:r>
-        <w:t xml:space="preserve"> </w:t>
-      </w:r>
-      <w:r>
-        <w:t xml:space="preserve">(bundled). In</w:t>
-      </w:r>
-      <w:r>
-        <w:t xml:space="preserve"> </w:t>
-      </w:r>
-      <w:r>
-        <w:rPr>
-          <w:b/>
-        </w:rPr>
-        <w:t xml:space="preserve">6. Statistics</w:t>
-      </w:r>
-      <w:r>
-        <w:t xml:space="preserve"> </w:t>
-      </w:r>
-      <w:r>
-        <w:t xml:space="preserve">(desktop: tick the group box, then</w:t>
-      </w:r>
-      <w:r>
-        <w:t xml:space="preserve"> </w:t>
-      </w:r>
-      <w:r>
-        <w:rPr>
-          <w:b/>
-        </w:rPr>
-        <w:t xml:space="preserve">Enable statistics</w:t>
-      </w:r>
-      <w:r>
-        <w:t xml:space="preserve">; browser:</w:t>
-      </w:r>
-      <w:r>
-        <w:t xml:space="preserve"> </w:t>
-      </w:r>
-      <w:r>
-        <w:rPr>
-          <w:b/>
-        </w:rPr>
-        <w:t xml:space="preserve">Statistical tests &amp; annotations</w:t>
-      </w:r>
-      <w:r>
-        <w:t xml:space="preserve"> </w:t>
-      </w:r>
-      <w:r>
-        <w:t xml:space="preserve">expander):</w:t>
+        <w:t xml:space="preserve">Test</w:t>
+      </w:r>
+      <w:r>
+        <w:t xml:space="preserve"> </w:t>
+      </w:r>
+      <w:r>
+        <w:t xml:space="preserve">— e.g. </w:t>
+      </w:r>
+      <w:r>
+        <w:rPr>
+          <w:i/>
+        </w:rPr>
+        <w:t xml:space="preserve">Welch’s t-test</w:t>
+      </w:r>
+      <w:r>
+        <w:t xml:space="preserve">. Eighteen methods are available (t-tests, Mann-Whitney, Wilcoxon, ANOVA variants, Kruskal-Wallis, Dunn, chi-square, Fisher, log-rank, Cox, Pearson, Spearman, linear regression, GLM).</w:t>
+      </w:r>
+      <w:r>
+        <w:t xml:space="preserve"> </w:t>
+      </w:r>
+      <w:r>
+        <w:rPr>
+          <w:i/>
+        </w:rPr>
+        <w:t xml:space="preserve">Auto-suggest</w:t>
+      </w:r>
+      <w:r>
+        <w:t xml:space="preserve"> </w:t>
+      </w:r>
+      <w:r>
+        <w:t xml:space="preserve">proposes one from the mapping; it is a suggestion, not a decision.</w:t>
       </w:r>
     </w:p>
     <w:p>
       <w:pPr>
         <w:numPr>
           <w:ilvl w:val="0"/>
-          <w:numId w:val="1007"/>
+          <w:numId w:val="1006"/>
         </w:numPr>
         <w:pStyle w:val="Compact"/>
       </w:pPr>
@@ -2649,44 +2842,20 @@
         <w:rPr>
           <w:b/>
         </w:rPr>
-        <w:t xml:space="preserve">Test</w:t>
-      </w:r>
-      <w:r>
-        <w:t xml:space="preserve"> </w:t>
-      </w:r>
-      <w:r>
-        <w:t xml:space="preserve">— e.g. </w:t>
-      </w:r>
-      <w:r>
-        <w:rPr>
-          <w:i/>
-        </w:rPr>
-        <w:t xml:space="preserve">Welch’s t-test</w:t>
-      </w:r>
-      <w:r>
-        <w:t xml:space="preserve">. Eighteen methods are available (t-tests, Mann-Whitney, Wilcoxon, ANOVA variants, Kruskal-Wallis, Dunn, chi-square, Fisher, log-rank, Cox, Pearson, Spearman, linear regression, GLM).</w:t>
-      </w:r>
-      <w:r>
-        <w:t xml:space="preserve"> </w:t>
-      </w:r>
-      <w:r>
-        <w:rPr>
-          <w:i/>
-        </w:rPr>
-        <w:t xml:space="preserve">Auto-suggest</w:t>
-      </w:r>
-      <w:r>
-        <w:t xml:space="preserve"> </w:t>
-      </w:r>
-      <w:r>
-        <w:t xml:space="preserve">proposes one from the mapping; it is a suggestion, not a decision.</w:t>
+        <w:t xml:space="preserve">Comparison</w:t>
+      </w:r>
+      <w:r>
+        <w:t xml:space="preserve"> </w:t>
+      </w:r>
+      <w:r>
+        <w:t xml:space="preserve">— all groups pairwise, compare to a control, within each x category, selected pairs, or omnibus only.</w:t>
       </w:r>
     </w:p>
     <w:p>
       <w:pPr>
         <w:numPr>
           <w:ilvl w:val="0"/>
-          <w:numId w:val="1007"/>
+          <w:numId w:val="1006"/>
         </w:numPr>
         <w:pStyle w:val="Compact"/>
       </w:pPr>
@@ -2694,20 +2863,20 @@
         <w:rPr>
           <w:b/>
         </w:rPr>
-        <w:t xml:space="preserve">Comparison</w:t>
-      </w:r>
-      <w:r>
-        <w:t xml:space="preserve"> </w:t>
-      </w:r>
-      <w:r>
-        <w:t xml:space="preserve">— all groups pairwise, compare to a control, within each x category, selected pairs, or omnibus only.</w:t>
+        <w:t xml:space="preserve">Correction</w:t>
+      </w:r>
+      <w:r>
+        <w:t xml:space="preserve"> </w:t>
+      </w:r>
+      <w:r>
+        <w:t xml:space="preserve">— Benjamini–Hochberg FDR, Bonferroni, Holm, or none.</w:t>
       </w:r>
     </w:p>
     <w:p>
       <w:pPr>
         <w:numPr>
           <w:ilvl w:val="0"/>
-          <w:numId w:val="1007"/>
+          <w:numId w:val="1006"/>
         </w:numPr>
         <w:pStyle w:val="Compact"/>
       </w:pPr>
@@ -2715,41 +2884,20 @@
         <w:rPr>
           <w:b/>
         </w:rPr>
-        <w:t xml:space="preserve">Correction</w:t>
-      </w:r>
-      <w:r>
-        <w:t xml:space="preserve"> </w:t>
-      </w:r>
-      <w:r>
-        <w:t xml:space="preserve">— Benjamini–Hochberg FDR, Bonferroni, Holm, or none.</w:t>
+        <w:t xml:space="preserve">Annotation shows / placement</w:t>
+      </w:r>
+      <w:r>
+        <w:t xml:space="preserve"> </w:t>
+      </w:r>
+      <w:r>
+        <w:t xml:space="preserve">— stars, exact p, adjusted p, statistic, effect size…; brackets between compared groups, or one label above each bar when comparing to a control.</w:t>
       </w:r>
     </w:p>
     <w:p>
       <w:pPr>
         <w:numPr>
           <w:ilvl w:val="0"/>
-          <w:numId w:val="1007"/>
-        </w:numPr>
-        <w:pStyle w:val="Compact"/>
-      </w:pPr>
-      <w:r>
-        <w:rPr>
-          <w:b/>
-        </w:rPr>
-        <w:t xml:space="preserve">Annotation shows / placement</w:t>
-      </w:r>
-      <w:r>
-        <w:t xml:space="preserve"> </w:t>
-      </w:r>
-      <w:r>
-        <w:t xml:space="preserve">— stars, exact p, adjusted p, statistic, effect size…; brackets between compared groups, or one label above each bar when comparing to a control.</w:t>
-      </w:r>
-    </w:p>
-    <w:p>
-      <w:pPr>
-        <w:numPr>
-          <w:ilvl w:val="0"/>
-          <w:numId w:val="1007"/>
+          <w:numId w:val="1006"/>
         </w:numPr>
         <w:pStyle w:val="Compact"/>
       </w:pPr>
@@ -2960,7 +3108,7 @@
       <w:pPr>
         <w:numPr>
           <w:ilvl w:val="0"/>
-          <w:numId w:val="1008"/>
+          <w:numId w:val="1007"/>
         </w:numPr>
         <w:pStyle w:val="Compact"/>
       </w:pPr>
@@ -3059,6 +3207,267 @@
       </w:r>
       <w:r>
         <w:t xml:space="preserve">.</w:t>
+      </w:r>
+    </w:p>
+    <w:p>
+      <w:pPr>
+        <w:numPr>
+          <w:ilvl w:val="0"/>
+          <w:numId w:val="1007"/>
+        </w:numPr>
+        <w:pStyle w:val="Compact"/>
+      </w:pPr>
+      <w:r>
+        <w:rPr>
+          <w:b/>
+        </w:rPr>
+        <w:t xml:space="preserve">② Define groups</w:t>
+      </w:r>
+      <w:r>
+        <w:t xml:space="preserve"> </w:t>
+      </w:r>
+      <w:r>
+        <w:t xml:space="preserve">— upload a metadata file, take one from another worksheet, or type a group per sample column; then</w:t>
+      </w:r>
+      <w:r>
+        <w:t xml:space="preserve"> </w:t>
+      </w:r>
+      <w:r>
+        <w:rPr>
+          <w:b/>
+        </w:rPr>
+        <w:t xml:space="preserve">Confirm groups</w:t>
+      </w:r>
+      <w:r>
+        <w:t xml:space="preserve">.</w:t>
+      </w:r>
+    </w:p>
+    <w:p>
+      <w:pPr>
+        <w:numPr>
+          <w:ilvl w:val="0"/>
+          <w:numId w:val="1007"/>
+        </w:numPr>
+        <w:pStyle w:val="Compact"/>
+      </w:pPr>
+      <w:r>
+        <w:rPr>
+          <w:b/>
+        </w:rPr>
+        <w:t xml:space="preserve">③ Preprocess (raw-like)</w:t>
+      </w:r>
+      <w:r>
+        <w:t xml:space="preserve"> </w:t>
+      </w:r>
+      <w:r>
+        <w:t xml:space="preserve">— optional, for raw-like data:</w:t>
+      </w:r>
+      <w:r>
+        <w:t xml:space="preserve"> </w:t>
+      </w:r>
+      <w:r>
+        <w:rPr>
+          <w:b/>
+        </w:rPr>
+        <w:t xml:space="preserve">Run diagnostics</w:t>
+      </w:r>
+      <w:r>
+        <w:t xml:space="preserve"> </w:t>
+      </w:r>
+      <w:r>
+        <w:t xml:space="preserve">(suspected data type, skew, zeros, negatives), preview a</w:t>
+      </w:r>
+      <w:r>
+        <w:t xml:space="preserve"> </w:t>
+      </w:r>
+      <w:r>
+        <w:rPr>
+          <w:b/>
+        </w:rPr>
+        <w:t xml:space="preserve">QC plot</w:t>
+      </w:r>
+      <w:r>
+        <w:t xml:space="preserve">, pick one of the</w:t>
+      </w:r>
+      <w:r>
+        <w:t xml:space="preserve"> </w:t>
+      </w:r>
+      <w:r>
+        <w:rPr>
+          <w:b/>
+        </w:rPr>
+        <w:t xml:space="preserve">recommended preprocessing</w:t>
+      </w:r>
+      <w:r>
+        <w:t xml:space="preserve"> </w:t>
+      </w:r>
+      <w:r>
+        <w:t xml:space="preserve">recipes (e.g. </w:t>
+      </w:r>
+      <w:r>
+        <w:rPr>
+          <w:i/>
+        </w:rPr>
+        <w:t xml:space="preserve">Total-sum normalize → log2 → z-score</w:t>
+      </w:r>
+      <w:r>
+        <w:t xml:space="preserve">; nothing is applied automatically), then</w:t>
+      </w:r>
+      <w:r>
+        <w:t xml:space="preserve"> </w:t>
+      </w:r>
+      <w:r>
+        <w:rPr>
+          <w:b/>
+        </w:rPr>
+        <w:t xml:space="preserve">Apply preprocessing → use processed matrix</w:t>
+      </w:r>
+      <w:r>
+        <w:t xml:space="preserve">. Each step is recorded; the original matrix is never modified;</w:t>
+      </w:r>
+      <w:r>
+        <w:t xml:space="preserve"> </w:t>
+      </w:r>
+      <w:r>
+        <w:rPr>
+          <w:b/>
+        </w:rPr>
+        <w:t xml:space="preserve">Save before/after QC report…</w:t>
+      </w:r>
+      <w:r>
+        <w:t xml:space="preserve"> </w:t>
+      </w:r>
+      <w:r>
+        <w:t xml:space="preserve">writes the report.</w:t>
+      </w:r>
+    </w:p>
+    <w:p>
+      <w:pPr>
+        <w:numPr>
+          <w:ilvl w:val="0"/>
+          <w:numId w:val="1007"/>
+        </w:numPr>
+        <w:pStyle w:val="Compact"/>
+      </w:pPr>
+      <w:r>
+        <w:rPr>
+          <w:b/>
+        </w:rPr>
+        <w:t xml:space="preserve">④ Validation</w:t>
+      </w:r>
+      <w:r>
+        <w:t xml:space="preserve"> </w:t>
+      </w:r>
+      <w:r>
+        <w:t xml:space="preserve">— a report of the confirmed mapping and groups (features, samples, groups, missing values, duplicate ids) with warnings or</w:t>
+      </w:r>
+      <w:r>
+        <w:t xml:space="preserve"> </w:t>
+      </w:r>
+      <w:r>
+        <w:rPr>
+          <w:i/>
+        </w:rPr>
+        <w:t xml:space="preserve">✓ Validation passed</w:t>
+      </w:r>
+      <w:r>
+        <w:t xml:space="preserve">.</w:t>
+      </w:r>
+    </w:p>
+    <w:p>
+      <w:pPr>
+        <w:numPr>
+          <w:ilvl w:val="0"/>
+          <w:numId w:val="1007"/>
+        </w:numPr>
+        <w:pStyle w:val="Compact"/>
+      </w:pPr>
+      <w:r>
+        <w:rPr>
+          <w:b/>
+        </w:rPr>
+        <w:t xml:space="preserve">⑤ Recommend &amp; generate</w:t>
+      </w:r>
+      <w:r>
+        <w:t xml:space="preserve"> </w:t>
+      </w:r>
+      <w:r>
+        <w:t xml:space="preserve">— an optional two-group</w:t>
+      </w:r>
+      <w:r>
+        <w:t xml:space="preserve"> </w:t>
+      </w:r>
+      <w:r>
+        <w:rPr>
+          <w:b/>
+        </w:rPr>
+        <w:t xml:space="preserve">differential summary</w:t>
+      </w:r>
+      <w:r>
+        <w:t xml:space="preserve"> </w:t>
+      </w:r>
+      <w:r>
+        <w:t xml:space="preserve">(test, correction, groups A/B), then recommended plots (heatmap, PCA, box plots, volcano/MA once a summary exists) with</w:t>
+      </w:r>
+      <w:r>
+        <w:t xml:space="preserve"> </w:t>
+      </w:r>
+      <w:r>
+        <w:rPr>
+          <w:b/>
+        </w:rPr>
+        <w:t xml:space="preserve">Quick preview</w:t>
+      </w:r>
+      <w:r>
+        <w:t xml:space="preserve"> </w:t>
+      </w:r>
+      <w:r>
+        <w:t xml:space="preserve">and</w:t>
+      </w:r>
+      <w:r>
+        <w:t xml:space="preserve"> </w:t>
+      </w:r>
+      <w:r>
+        <w:rPr>
+          <w:b/>
+        </w:rPr>
+        <w:t xml:space="preserve">Open in plot editor</w:t>
+      </w:r>
+      <w:r>
+        <w:t xml:space="preserve">, which hands the derived table to the full editor with its provenance.</w:t>
+      </w:r>
+    </w:p>
+    <w:p>
+      <w:pPr>
+        <w:pStyle w:val="Heading2"/>
+      </w:pPr>
+      <w:bookmarkStart w:id="41" w:name="save-a-figure-preset"/>
+      <w:r>
+        <w:t xml:space="preserve">9. Save a Figure preset</w:t>
+      </w:r>
+      <w:bookmarkEnd w:id="41"/>
+    </w:p>
+    <w:p>
+      <w:pPr>
+        <w:pStyle w:val="FirstParagraph"/>
+      </w:pPr>
+      <w:r>
+        <w:t xml:space="preserve">A</w:t>
+      </w:r>
+      <w:r>
+        <w:t xml:space="preserve"> </w:t>
+      </w:r>
+      <w:r>
+        <w:rPr>
+          <w:b/>
+        </w:rPr>
+        <w:t xml:space="preserve">Figure preset</w:t>
+      </w:r>
+      <w:r>
+        <w:t xml:space="preserve"> </w:t>
+      </w:r>
+      <w:r>
+        <w:t xml:space="preserve">is your configuration without your data. Configure a figure once, save the preset, and apply it to a new dataset of the same plot type later.</w:t>
       </w:r>
     </w:p>
     <w:p>
@@ -3073,22 +3482,22 @@
         <w:rPr>
           <w:b/>
         </w:rPr>
-        <w:t xml:space="preserve">② Define groups</w:t>
-      </w:r>
-      <w:r>
-        <w:t xml:space="preserve"> </w:t>
-      </w:r>
-      <w:r>
-        <w:t xml:space="preserve">— upload a metadata file, take one from another worksheet, or type a group per sample column; then</w:t>
-      </w:r>
-      <w:r>
-        <w:t xml:space="preserve"> </w:t>
-      </w:r>
-      <w:r>
-        <w:rPr>
-          <w:b/>
-        </w:rPr>
-        <w:t xml:space="preserve">Confirm groups</w:t>
+        <w:t xml:space="preserve">Figure style only</w:t>
+      </w:r>
+      <w:r>
+        <w:t xml:space="preserve"> </w:t>
+      </w:r>
+      <w:r>
+        <w:t xml:space="preserve">— fonts, palette, line/marker sizes, tick angles, margins, legend and colorbar placement, export size/DPI, and visual plot options (violin vs box, colormap, node colours…). Portable: this is the lab’s</w:t>
+      </w:r>
+      <w:r>
+        <w:t xml:space="preserve"> </w:t>
+      </w:r>
+      <w:r>
+        <w:rPr>
+          <w:i/>
+        </w:rPr>
+        <w:t xml:space="preserve">Lab_Default_Heatmap.mmfpreset.json</w:t>
       </w:r>
       <w:r>
         <w:t xml:space="preserve">.</w:t>
@@ -3099,267 +3508,6 @@
         <w:numPr>
           <w:ilvl w:val="0"/>
           <w:numId w:val="1008"/>
-        </w:numPr>
-        <w:pStyle w:val="Compact"/>
-      </w:pPr>
-      <w:r>
-        <w:rPr>
-          <w:b/>
-        </w:rPr>
-        <w:t xml:space="preserve">③ Preprocess (raw-like)</w:t>
-      </w:r>
-      <w:r>
-        <w:t xml:space="preserve"> </w:t>
-      </w:r>
-      <w:r>
-        <w:t xml:space="preserve">— optional, for raw-like data:</w:t>
-      </w:r>
-      <w:r>
-        <w:t xml:space="preserve"> </w:t>
-      </w:r>
-      <w:r>
-        <w:rPr>
-          <w:b/>
-        </w:rPr>
-        <w:t xml:space="preserve">Run diagnostics</w:t>
-      </w:r>
-      <w:r>
-        <w:t xml:space="preserve"> </w:t>
-      </w:r>
-      <w:r>
-        <w:t xml:space="preserve">(suspected data type, skew, zeros, negatives), preview a</w:t>
-      </w:r>
-      <w:r>
-        <w:t xml:space="preserve"> </w:t>
-      </w:r>
-      <w:r>
-        <w:rPr>
-          <w:b/>
-        </w:rPr>
-        <w:t xml:space="preserve">QC plot</w:t>
-      </w:r>
-      <w:r>
-        <w:t xml:space="preserve">, pick one of the</w:t>
-      </w:r>
-      <w:r>
-        <w:t xml:space="preserve"> </w:t>
-      </w:r>
-      <w:r>
-        <w:rPr>
-          <w:b/>
-        </w:rPr>
-        <w:t xml:space="preserve">recommended preprocessing</w:t>
-      </w:r>
-      <w:r>
-        <w:t xml:space="preserve"> </w:t>
-      </w:r>
-      <w:r>
-        <w:t xml:space="preserve">recipes (e.g. </w:t>
-      </w:r>
-      <w:r>
-        <w:rPr>
-          <w:i/>
-        </w:rPr>
-        <w:t xml:space="preserve">Total-sum normalize → log2 → z-score</w:t>
-      </w:r>
-      <w:r>
-        <w:t xml:space="preserve">; nothing is applied automatically), then</w:t>
-      </w:r>
-      <w:r>
-        <w:t xml:space="preserve"> </w:t>
-      </w:r>
-      <w:r>
-        <w:rPr>
-          <w:b/>
-        </w:rPr>
-        <w:t xml:space="preserve">Apply preprocessing → use processed matrix</w:t>
-      </w:r>
-      <w:r>
-        <w:t xml:space="preserve">. Each step is recorded; the original matrix is never modified;</w:t>
-      </w:r>
-      <w:r>
-        <w:t xml:space="preserve"> </w:t>
-      </w:r>
-      <w:r>
-        <w:rPr>
-          <w:b/>
-        </w:rPr>
-        <w:t xml:space="preserve">Save before/after QC report…</w:t>
-      </w:r>
-      <w:r>
-        <w:t xml:space="preserve"> </w:t>
-      </w:r>
-      <w:r>
-        <w:t xml:space="preserve">writes the report.</w:t>
-      </w:r>
-    </w:p>
-    <w:p>
-      <w:pPr>
-        <w:numPr>
-          <w:ilvl w:val="0"/>
-          <w:numId w:val="1008"/>
-        </w:numPr>
-        <w:pStyle w:val="Compact"/>
-      </w:pPr>
-      <w:r>
-        <w:rPr>
-          <w:b/>
-        </w:rPr>
-        <w:t xml:space="preserve">④ Validation</w:t>
-      </w:r>
-      <w:r>
-        <w:t xml:space="preserve"> </w:t>
-      </w:r>
-      <w:r>
-        <w:t xml:space="preserve">— a report of the confirmed mapping and groups (features, samples, groups, missing values, duplicate ids) with warnings or</w:t>
-      </w:r>
-      <w:r>
-        <w:t xml:space="preserve"> </w:t>
-      </w:r>
-      <w:r>
-        <w:rPr>
-          <w:i/>
-        </w:rPr>
-        <w:t xml:space="preserve">✓ Validation passed</w:t>
-      </w:r>
-      <w:r>
-        <w:t xml:space="preserve">.</w:t>
-      </w:r>
-    </w:p>
-    <w:p>
-      <w:pPr>
-        <w:numPr>
-          <w:ilvl w:val="0"/>
-          <w:numId w:val="1008"/>
-        </w:numPr>
-        <w:pStyle w:val="Compact"/>
-      </w:pPr>
-      <w:r>
-        <w:rPr>
-          <w:b/>
-        </w:rPr>
-        <w:t xml:space="preserve">⑤ Recommend &amp; generate</w:t>
-      </w:r>
-      <w:r>
-        <w:t xml:space="preserve"> </w:t>
-      </w:r>
-      <w:r>
-        <w:t xml:space="preserve">— an optional two-group</w:t>
-      </w:r>
-      <w:r>
-        <w:t xml:space="preserve"> </w:t>
-      </w:r>
-      <w:r>
-        <w:rPr>
-          <w:b/>
-        </w:rPr>
-        <w:t xml:space="preserve">differential summary</w:t>
-      </w:r>
-      <w:r>
-        <w:t xml:space="preserve"> </w:t>
-      </w:r>
-      <w:r>
-        <w:t xml:space="preserve">(test, correction, groups A/B), then recommended plots (heatmap, PCA, box plots, volcano/MA once a summary exists) with</w:t>
-      </w:r>
-      <w:r>
-        <w:t xml:space="preserve"> </w:t>
-      </w:r>
-      <w:r>
-        <w:rPr>
-          <w:b/>
-        </w:rPr>
-        <w:t xml:space="preserve">Quick preview</w:t>
-      </w:r>
-      <w:r>
-        <w:t xml:space="preserve"> </w:t>
-      </w:r>
-      <w:r>
-        <w:t xml:space="preserve">and</w:t>
-      </w:r>
-      <w:r>
-        <w:t xml:space="preserve"> </w:t>
-      </w:r>
-      <w:r>
-        <w:rPr>
-          <w:b/>
-        </w:rPr>
-        <w:t xml:space="preserve">Open in plot editor</w:t>
-      </w:r>
-      <w:r>
-        <w:t xml:space="preserve">, which hands the derived table to the full editor with its provenance.</w:t>
-      </w:r>
-    </w:p>
-    <w:p>
-      <w:pPr>
-        <w:pStyle w:val="Heading2"/>
-      </w:pPr>
-      <w:bookmarkStart w:id="41" w:name="save-a-figure-preset"/>
-      <w:r>
-        <w:t xml:space="preserve">9. Save a Figure preset</w:t>
-      </w:r>
-      <w:bookmarkEnd w:id="41"/>
-    </w:p>
-    <w:p>
-      <w:pPr>
-        <w:pStyle w:val="FirstParagraph"/>
-      </w:pPr>
-      <w:r>
-        <w:t xml:space="preserve">A</w:t>
-      </w:r>
-      <w:r>
-        <w:t xml:space="preserve"> </w:t>
-      </w:r>
-      <w:r>
-        <w:rPr>
-          <w:b/>
-        </w:rPr>
-        <w:t xml:space="preserve">Figure preset</w:t>
-      </w:r>
-      <w:r>
-        <w:t xml:space="preserve"> </w:t>
-      </w:r>
-      <w:r>
-        <w:t xml:space="preserve">is your configuration without your data. Configure a figure once, save the preset, and apply it to a new dataset of the same plot type later.</w:t>
-      </w:r>
-    </w:p>
-    <w:p>
-      <w:pPr>
-        <w:numPr>
-          <w:ilvl w:val="0"/>
-          <w:numId w:val="1009"/>
-        </w:numPr>
-        <w:pStyle w:val="Compact"/>
-      </w:pPr>
-      <w:r>
-        <w:rPr>
-          <w:b/>
-        </w:rPr>
-        <w:t xml:space="preserve">Figure style only</w:t>
-      </w:r>
-      <w:r>
-        <w:t xml:space="preserve"> </w:t>
-      </w:r>
-      <w:r>
-        <w:t xml:space="preserve">— fonts, palette, line/marker sizes, tick angles, margins, legend and colorbar placement, export size/DPI, and visual plot options (violin vs box, colormap, node colours…). Portable: this is the lab’s</w:t>
-      </w:r>
-      <w:r>
-        <w:t xml:space="preserve"> </w:t>
-      </w:r>
-      <w:r>
-        <w:rPr>
-          <w:i/>
-        </w:rPr>
-        <w:t xml:space="preserve">Lab_Default_Heatmap.mmfpreset.json</w:t>
-      </w:r>
-      <w:r>
-        <w:t xml:space="preserve">.</w:t>
-      </w:r>
-    </w:p>
-    <w:p>
-      <w:pPr>
-        <w:numPr>
-          <w:ilvl w:val="0"/>
-          <w:numId w:val="1009"/>
         </w:numPr>
         <w:pStyle w:val="Compact"/>
       </w:pPr>
@@ -3829,7 +3977,7 @@
       <w:pPr>
         <w:numPr>
           <w:ilvl w:val="0"/>
-          <w:numId w:val="1010"/>
+          <w:numId w:val="1009"/>
         </w:numPr>
         <w:pStyle w:val="Compact"/>
       </w:pPr>
@@ -3871,7 +4019,7 @@
       <w:pPr>
         <w:numPr>
           <w:ilvl w:val="0"/>
-          <w:numId w:val="1010"/>
+          <w:numId w:val="1009"/>
         </w:numPr>
         <w:pStyle w:val="Compact"/>
       </w:pPr>
@@ -3961,7 +4109,7 @@
       <w:pPr>
         <w:numPr>
           <w:ilvl w:val="0"/>
-          <w:numId w:val="1010"/>
+          <w:numId w:val="1009"/>
         </w:numPr>
         <w:pStyle w:val="Compact"/>
       </w:pPr>
@@ -4003,7 +4151,7 @@
       <w:pPr>
         <w:numPr>
           <w:ilvl w:val="0"/>
-          <w:numId w:val="1010"/>
+          <w:numId w:val="1009"/>
         </w:numPr>
         <w:pStyle w:val="Compact"/>
       </w:pPr>
@@ -4039,7 +4187,7 @@
       <w:pPr>
         <w:numPr>
           <w:ilvl w:val="0"/>
-          <w:numId w:val="1010"/>
+          <w:numId w:val="1009"/>
         </w:numPr>
         <w:pStyle w:val="Compact"/>
       </w:pPr>
@@ -4572,7 +4720,7 @@
       <w:pPr>
         <w:numPr>
           <w:ilvl w:val="0"/>
-          <w:numId w:val="1011"/>
+          <w:numId w:val="1010"/>
         </w:numPr>
         <w:pStyle w:val="Compact"/>
       </w:pPr>
@@ -4629,7 +4777,7 @@
       <w:pPr>
         <w:numPr>
           <w:ilvl w:val="0"/>
-          <w:numId w:val="1011"/>
+          <w:numId w:val="1010"/>
         </w:numPr>
         <w:pStyle w:val="Compact"/>
       </w:pPr>
@@ -4662,7 +4810,7 @@
       <w:pPr>
         <w:numPr>
           <w:ilvl w:val="0"/>
-          <w:numId w:val="1011"/>
+          <w:numId w:val="1010"/>
         </w:numPr>
         <w:pStyle w:val="Compact"/>
       </w:pPr>
@@ -4689,7 +4837,7 @@
       <w:pPr>
         <w:numPr>
           <w:ilvl w:val="0"/>
-          <w:numId w:val="1011"/>
+          <w:numId w:val="1010"/>
         </w:numPr>
         <w:pStyle w:val="Compact"/>
       </w:pPr>
@@ -5217,9 +5365,6 @@
     <w:abstractNumId w:val="991"/>
   </w:num>
   <w:num w:numId="1003">
-    <w:abstractNumId w:val="991"/>
-  </w:num>
-  <w:num w:numId="1004">
     <w:abstractNumId w:val="99411"/>
     <w:lvlOverride w:ilvl="0">
       <w:startOverride w:val="1"/>
@@ -5249,7 +5394,7 @@
       <w:startOverride w:val="1"/>
     </w:lvlOverride>
   </w:num>
-  <w:num w:numId="1005">
+  <w:num w:numId="1004">
     <w:abstractNumId w:val="99417"/>
     <w:lvlOverride w:ilvl="0">
       <w:startOverride w:val="7"/>
@@ -5279,8 +5424,38 @@
       <w:startOverride w:val="7"/>
     </w:lvlOverride>
   </w:num>
+  <w:num w:numId="1005">
+    <w:abstractNumId w:val="991"/>
+  </w:num>
   <w:num w:numId="1006">
-    <w:abstractNumId w:val="991"/>
+    <w:abstractNumId w:val="99411"/>
+    <w:lvlOverride w:ilvl="0">
+      <w:startOverride w:val="1"/>
+    </w:lvlOverride>
+    <w:lvlOverride w:ilvl="1">
+      <w:startOverride w:val="1"/>
+    </w:lvlOverride>
+    <w:lvlOverride w:ilvl="2">
+      <w:startOverride w:val="1"/>
+    </w:lvlOverride>
+    <w:lvlOverride w:ilvl="3">
+      <w:startOverride w:val="1"/>
+    </w:lvlOverride>
+    <w:lvlOverride w:ilvl="4">
+      <w:startOverride w:val="1"/>
+    </w:lvlOverride>
+    <w:lvlOverride w:ilvl="5">
+      <w:startOverride w:val="1"/>
+    </w:lvlOverride>
+    <w:lvlOverride w:ilvl="6">
+      <w:startOverride w:val="1"/>
+    </w:lvlOverride>
+    <w:lvlOverride w:ilvl="7">
+      <w:startOverride w:val="1"/>
+    </w:lvlOverride>
+    <w:lvlOverride w:ilvl="8">
+      <w:startOverride w:val="1"/>
+    </w:lvlOverride>
   </w:num>
   <w:num w:numId="1007">
     <w:abstractNumId w:val="99411"/>
@@ -5313,42 +5488,12 @@
     </w:lvlOverride>
   </w:num>
   <w:num w:numId="1008">
-    <w:abstractNumId w:val="99411"/>
-    <w:lvlOverride w:ilvl="0">
-      <w:startOverride w:val="1"/>
-    </w:lvlOverride>
-    <w:lvlOverride w:ilvl="1">
-      <w:startOverride w:val="1"/>
-    </w:lvlOverride>
-    <w:lvlOverride w:ilvl="2">
-      <w:startOverride w:val="1"/>
-    </w:lvlOverride>
-    <w:lvlOverride w:ilvl="3">
-      <w:startOverride w:val="1"/>
-    </w:lvlOverride>
-    <w:lvlOverride w:ilvl="4">
-      <w:startOverride w:val="1"/>
-    </w:lvlOverride>
-    <w:lvlOverride w:ilvl="5">
-      <w:startOverride w:val="1"/>
-    </w:lvlOverride>
-    <w:lvlOverride w:ilvl="6">
-      <w:startOverride w:val="1"/>
-    </w:lvlOverride>
-    <w:lvlOverride w:ilvl="7">
-      <w:startOverride w:val="1"/>
-    </w:lvlOverride>
-    <w:lvlOverride w:ilvl="8">
-      <w:startOverride w:val="1"/>
-    </w:lvlOverride>
+    <w:abstractNumId w:val="991"/>
   </w:num>
   <w:num w:numId="1009">
     <w:abstractNumId w:val="991"/>
   </w:num>
   <w:num w:numId="1010">
-    <w:abstractNumId w:val="991"/>
-  </w:num>
-  <w:num w:numId="1011">
     <w:abstractNumId w:val="991"/>
   </w:num>
 </w:numbering>

</xml_diff>

<commit_message>
Docs, manuals, changelog, reports and GUI tests for reproducible figure packages
- docs/FIGURE_PACKAGES.md (format, three artifacts, integrity, privacy, sharing workflow, API);
  Quick Start and User Manual sources updated and rebuilt (Markdown/DOCX/PDF); QUICKSTART, DESKTOP_APP,
  EXPORTING_PUBLICATION_FIGURES, MULTI_PANEL_FIGURES, IMPORT_EXTERNAL_PANELS, MATRIX_WORKFLOW, STATISTICS.
- CHANGELOG: [Unreleased — v1.1.1 candidate] entry (no version bump).
- reports/v1.1.1_manuscript_claim_audit.md (155 sentences screened, classified),
  reports/v1.1.1_manual_acceptance_test.md (TEST 1–9 + acceptance checklist).
- tests/test_desktop_gui.py: landing button, save→move→reopen with statistics, invalid/tampered
  package errors, load_path/recent routing, composite reopen (run where PySide6 is installed).

Co-Authored-By: Claude Fable 5.1 <noreply@anthropic.com>
</commit_message>
<xml_diff>
--- a/docs/manuals/Quick_Start/MakeMyFigure_Quick_Start.docx
+++ b/docs/manuals/Quick_Start/MakeMyFigure_Quick_Start.docx
@@ -70,7 +70,7 @@
         <w:rPr>
           <w:rStyle w:val="VerbatimChar"/>
         </w:rPr>
-        <w:t xml:space="preserve">cea315c</w:t>
+        <w:t xml:space="preserve">473d495</w:t>
       </w:r>
       <w:r>
         <w:br/>
@@ -85,7 +85,7 @@
         <w:t xml:space="preserve"> </w:t>
       </w:r>
       <w:r>
-        <w:t xml:space="preserve">2026-09-06</w:t>
+        <w:t xml:space="preserve">2026-09-11</w:t>
       </w:r>
     </w:p>
     <w:p>
@@ -366,7 +366,37 @@
         <w:t xml:space="preserve"> </w:t>
       </w:r>
       <w:r>
-        <w:t xml:space="preserve">JSON that records the configuration.</w:t>
+        <w:t xml:space="preserve">JSON that records the configuration — or</w:t>
+      </w:r>
+      <w:r>
+        <w:t xml:space="preserve"> </w:t>
+      </w:r>
+      <w:r>
+        <w:rPr>
+          <w:b/>
+        </w:rPr>
+        <w:t xml:space="preserve">Save Figure Package</w:t>
+      </w:r>
+      <w:r>
+        <w:t xml:space="preserve"> </w:t>
+      </w:r>
+      <w:r>
+        <w:t xml:space="preserve">to get one portable</w:t>
+      </w:r>
+      <w:r>
+        <w:t xml:space="preserve"> </w:t>
+      </w:r>
+      <w:r>
+        <w:rPr>
+          <w:rStyle w:val="VerbatimChar"/>
+        </w:rPr>
+        <w:t xml:space="preserve">.mmfpackage</w:t>
+      </w:r>
+      <w:r>
+        <w:t xml:space="preserve"> </w:t>
+      </w:r>
+      <w:r>
+        <w:t xml:space="preserve">that also freezes the data.</w:t>
       </w:r>
     </w:p>
     <w:p>
@@ -2401,7 +2431,19 @@
         <w:rPr>
           <w:b/>
         </w:rPr>
-        <w:t xml:space="preserve">5. Export → Export SVG / PNG / PDF / PlotSpec JSON</w:t>
+        <w:t xml:space="preserve">5. Export → Export SVG / PNG / PDF / Export PlotSpec JSON (specification only)</w:t>
+      </w:r>
+      <w:r>
+        <w:t xml:space="preserve">,</w:t>
+      </w:r>
+      <w:r>
+        <w:t xml:space="preserve"> </w:t>
+      </w:r>
+      <w:r>
+        <w:rPr>
+          <w:b/>
+        </w:rPr>
+        <w:t xml:space="preserve">Save Figure Package (.mmfpackage)</w:t>
       </w:r>
       <w:r>
         <w:t xml:space="preserve"> </w:t>
@@ -2419,37 +2461,82 @@
         <w:t xml:space="preserve">Export all as ZIP</w:t>
       </w:r>
       <w:r>
-        <w:t xml:space="preserve">; browser</w:t>
-      </w:r>
-      <w:r>
-        <w:t xml:space="preserve"> </w:t>
-      </w:r>
-      <w:r>
-        <w:rPr>
-          <w:b/>
-        </w:rPr>
-        <w:t xml:space="preserve">Export → SVG / PNG / PDF / PlotSpec JSON</w:t>
-      </w:r>
-      <w:r>
-        <w:t xml:space="preserve"> </w:t>
-      </w:r>
-      <w:r>
-        <w:t xml:space="preserve">download buttons. A</w:t>
-      </w:r>
-      <w:r>
-        <w:t xml:space="preserve"> </w:t>
-      </w:r>
-      <w:r>
-        <w:rPr>
-          <w:rStyle w:val="VerbatimChar"/>
-        </w:rPr>
-        <w:t xml:space="preserve">.plot_spec.json</w:t>
-      </w:r>
-      <w:r>
-        <w:t xml:space="preserve"> </w:t>
-      </w:r>
-      <w:r>
-        <w:t xml:space="preserve">sidecar is written with every export so the figure can be reproduced.</w:t>
+        <w:t xml:space="preserve"> </w:t>
+      </w:r>
+      <w:r>
+        <w:t xml:space="preserve">(figures + specs + package); browser</w:t>
+      </w:r>
+      <w:r>
+        <w:t xml:space="preserve"> </w:t>
+      </w:r>
+      <w:r>
+        <w:rPr>
+          <w:b/>
+        </w:rPr>
+        <w:t xml:space="preserve">Export → SVG / PNG / PDF / PlotSpec JSON / Figure Package</w:t>
+      </w:r>
+      <w:r>
+        <w:t xml:space="preserve"> </w:t>
+      </w:r>
+      <w:r>
+        <w:t xml:space="preserve">download buttons. The PlotSpec JSON records the configuration but</w:t>
+      </w:r>
+      <w:r>
+        <w:t xml:space="preserve"> </w:t>
+      </w:r>
+      <w:r>
+        <w:rPr>
+          <w:i/>
+        </w:rPr>
+        <w:t xml:space="preserve">not</w:t>
+      </w:r>
+      <w:r>
+        <w:t xml:space="preserve"> </w:t>
+      </w:r>
+      <w:r>
+        <w:t xml:space="preserve">the data — it needs the source table to reopen. The</w:t>
+      </w:r>
+      <w:r>
+        <w:t xml:space="preserve"> </w:t>
+      </w:r>
+      <w:r>
+        <w:rPr>
+          <w:b/>
+        </w:rPr>
+        <w:t xml:space="preserve">figure package</w:t>
+      </w:r>
+      <w:r>
+        <w:t xml:space="preserve"> </w:t>
+      </w:r>
+      <w:r>
+        <w:t xml:space="preserve">is the file to move or share: it holds the specification</w:t>
+      </w:r>
+      <w:r>
+        <w:t xml:space="preserve"> </w:t>
+      </w:r>
+      <w:r>
+        <w:rPr>
+          <w:b/>
+        </w:rPr>
+        <w:t xml:space="preserve">and</w:t>
+      </w:r>
+      <w:r>
+        <w:t xml:space="preserve"> </w:t>
+      </w:r>
+      <w:r>
+        <w:t xml:space="preserve">a frozen copy of the data, and reopens anywhere with</w:t>
+      </w:r>
+      <w:r>
+        <w:t xml:space="preserve"> </w:t>
+      </w:r>
+      <w:r>
+        <w:rPr>
+          <w:b/>
+        </w:rPr>
+        <w:t xml:space="preserve">Open Figure Package</w:t>
+      </w:r>
+      <w:r>
+        <w:t xml:space="preserve">.</w:t>
       </w:r>
     </w:p>
     <w:p>
@@ -3815,7 +3902,69 @@
         <w:t xml:space="preserve"> </w:t>
       </w:r>
       <w:r>
-        <w:t xml:space="preserve">figure, including the table name and column names. Every export writes one. An existing PlotSpec can be loaded as a full preset.</w:t>
+        <w:t xml:space="preserve">figure, including the table name and column names — but not the values; the source table is required to reopen it. An existing PlotSpec can be loaded as a full preset.</w:t>
+      </w:r>
+    </w:p>
+    <w:p>
+      <w:pPr>
+        <w:pStyle w:val="BodyText"/>
+      </w:pPr>
+      <w:r>
+        <w:t xml:space="preserve">A</w:t>
+      </w:r>
+      <w:r>
+        <w:t xml:space="preserve"> </w:t>
+      </w:r>
+      <w:r>
+        <w:rPr>
+          <w:b/>
+        </w:rPr>
+        <w:t xml:space="preserve">Figure package</w:t>
+      </w:r>
+      <w:r>
+        <w:t xml:space="preserve"> </w:t>
+      </w:r>
+      <w:r>
+        <w:t xml:space="preserve">(</w:t>
+      </w:r>
+      <w:r>
+        <w:rPr>
+          <w:rStyle w:val="VerbatimChar"/>
+        </w:rPr>
+        <w:t xml:space="preserve">.mmfpackage</w:t>
+      </w:r>
+      <w:r>
+        <w:t xml:space="preserve">) is the third kind of file: the PlotSpec (or FigureSpec)</w:t>
+      </w:r>
+      <w:r>
+        <w:t xml:space="preserve"> </w:t>
+      </w:r>
+      <w:r>
+        <w:rPr>
+          <w:i/>
+        </w:rPr>
+        <w:t xml:space="preserve">plus</w:t>
+      </w:r>
+      <w:r>
+        <w:t xml:space="preserve"> </w:t>
+      </w:r>
+      <w:r>
+        <w:t xml:space="preserve">a frozen copy of the exact data, the StatsSpec results, the Matrix Workflow records where they apply, imported images, previews and a checksum for every file. It is the one file to send to a collaborator;</w:t>
+      </w:r>
+      <w:r>
+        <w:t xml:space="preserve"> </w:t>
+      </w:r>
+      <w:r>
+        <w:rPr>
+          <w:b/>
+        </w:rPr>
+        <w:t xml:space="preserve">Open Figure Package</w:t>
+      </w:r>
+      <w:r>
+        <w:t xml:space="preserve"> </w:t>
+      </w:r>
+      <w:r>
+        <w:t xml:space="preserve">reproduces the figure without the original data files. Because it contains data, share it only with people who may see those data.</w:t>
       </w:r>
     </w:p>
     <w:p>
@@ -4225,7 +4374,64 @@
         <w:t xml:space="preserve">.figure_spec.json</w:t>
       </w:r>
       <w:r>
-        <w:t xml:space="preserve">).</w:t>
+        <w:t xml:space="preserve">; panel</w:t>
+      </w:r>
+      <w:r>
+        <w:t xml:space="preserve"> </w:t>
+      </w:r>
+      <w:r>
+        <w:rPr>
+          <w:i/>
+        </w:rPr>
+        <w:t xml:space="preserve">identities</w:t>
+      </w:r>
+      <w:r>
+        <w:t xml:space="preserve">, not the data).</w:t>
+      </w:r>
+      <w:r>
+        <w:t xml:space="preserve"> </w:t>
+      </w:r>
+      <w:r>
+        <w:rPr>
+          <w:b/>
+        </w:rPr>
+        <w:t xml:space="preserve">Save Figure Package…</w:t>
+      </w:r>
+      <w:r>
+        <w:t xml:space="preserve"> </w:t>
+      </w:r>
+      <w:r>
+        <w:t xml:space="preserve">writes one</w:t>
+      </w:r>
+      <w:r>
+        <w:t xml:space="preserve"> </w:t>
+      </w:r>
+      <w:r>
+        <w:rPr>
+          <w:rStyle w:val="VerbatimChar"/>
+        </w:rPr>
+        <w:t xml:space="preserve">.mmfpackage</w:t>
+      </w:r>
+      <w:r>
+        <w:t xml:space="preserve"> </w:t>
+      </w:r>
+      <w:r>
+        <w:t xml:space="preserve">with the FigureSpec, every panel’s PlotSpec/StatsSpec, the exact tables and imported images;</w:t>
+      </w:r>
+      <w:r>
+        <w:t xml:space="preserve"> </w:t>
+      </w:r>
+      <w:r>
+        <w:rPr>
+          <w:b/>
+        </w:rPr>
+        <w:t xml:space="preserve">Open Figure Package</w:t>
+      </w:r>
+      <w:r>
+        <w:t xml:space="preserve"> </w:t>
+      </w:r>
+      <w:r>
+        <w:t xml:space="preserve">rebuilds the composite here.</w:t>
       </w:r>
     </w:p>
     <w:p>
@@ -4661,7 +4867,16 @@
         <w:pStyle w:val="BodyText"/>
       </w:pPr>
       <w:r>
-        <w:t xml:space="preserve">Every export also writes</w:t>
+        <w:rPr>
+          <w:b/>
+        </w:rPr>
+        <w:t xml:space="preserve">Export PlotSpec JSON</w:t>
+      </w:r>
+      <w:r>
+        <w:t xml:space="preserve"> </w:t>
+      </w:r>
+      <w:r>
+        <w:t xml:space="preserve">writes</w:t>
       </w:r>
       <w:r>
         <w:t xml:space="preserve"> </w:t>
@@ -4673,7 +4888,25 @@
         <w:t xml:space="preserve">name.plot_spec.json</w:t>
       </w:r>
       <w:r>
-        <w:t xml:space="preserve">; when statistics ran,</w:t>
+        <w:t xml:space="preserve"> </w:t>
+      </w:r>
+      <w:r>
+        <w:t xml:space="preserve">(specification only);</w:t>
+      </w:r>
+      <w:r>
+        <w:t xml:space="preserve"> </w:t>
+      </w:r>
+      <w:r>
+        <w:rPr>
+          <w:b/>
+        </w:rPr>
+        <w:t xml:space="preserve">Export all as ZIP</w:t>
+      </w:r>
+      <w:r>
+        <w:t xml:space="preserve"> </w:t>
+      </w:r>
+      <w:r>
+        <w:t xml:space="preserve">bundles SVG/PNG/PDF,</w:t>
       </w:r>
       <w:r>
         <w:t xml:space="preserve"> </w:t>
@@ -4682,37 +4915,61 @@
         <w:rPr>
           <w:rStyle w:val="VerbatimChar"/>
         </w:rPr>
+        <w:t xml:space="preserve">name.plot_spec.json</w:t>
+      </w:r>
+      <w:r>
+        <w:t xml:space="preserve">,</w:t>
+      </w:r>
+      <w:r>
+        <w:t xml:space="preserve"> </w:t>
+      </w:r>
+      <w:r>
+        <w:rPr>
+          <w:rStyle w:val="VerbatimChar"/>
+        </w:rPr>
         <w:t xml:space="preserve">name.stats_spec.json</w:t>
       </w:r>
       <w:r>
         <w:t xml:space="preserve"> </w:t>
       </w:r>
       <w:r>
-        <w:t xml:space="preserve">as well. The desktop</w:t>
-      </w:r>
-      <w:r>
-        <w:t xml:space="preserve"> </w:t>
-      </w:r>
-      <w:r>
-        <w:rPr>
-          <w:b/>
-        </w:rPr>
-        <w:t xml:space="preserve">Export all as ZIP</w:t>
-      </w:r>
-      <w:r>
-        <w:t xml:space="preserve"> </w:t>
-      </w:r>
-      <w:r>
-        <w:t xml:space="preserve">bundles formats and sidecars.</w:t>
-      </w:r>
-    </w:p>
-    <w:p>
-      <w:pPr>
-        <w:pStyle w:val="Heading2"/>
-      </w:pPr>
-      <w:bookmarkStart w:id="48" w:name="where-to-get-help"/>
-      <w:r>
-        <w:t xml:space="preserve">12. Where to get help</w:t>
+        <w:t xml:space="preserve">when statistics ran, and</w:t>
+      </w:r>
+      <w:r>
+        <w:t xml:space="preserve"> </w:t>
+      </w:r>
+      <w:r>
+        <w:rPr>
+          <w:rStyle w:val="VerbatimChar"/>
+        </w:rPr>
+        <w:t xml:space="preserve">name.mmfpackage</w:t>
+      </w:r>
+      <w:r>
+        <w:t xml:space="preserve">.</w:t>
+      </w:r>
+      <w:r>
+        <w:t xml:space="preserve"> </w:t>
+      </w:r>
+      <w:r>
+        <w:rPr>
+          <w:b/>
+        </w:rPr>
+        <w:t xml:space="preserve">Save Figure Package</w:t>
+      </w:r>
+      <w:r>
+        <w:t xml:space="preserve"> </w:t>
+      </w:r>
+      <w:r>
+        <w:t xml:space="preserve">writes the package alone.</w:t>
+      </w:r>
+    </w:p>
+    <w:p>
+      <w:pPr>
+        <w:pStyle w:val="Heading3"/>
+      </w:pPr>
+      <w:bookmarkStart w:id="48" w:name="sharing-a-reproducible-figure"/>
+      <w:r>
+        <w:t xml:space="preserve">Sharing a reproducible figure</w:t>
       </w:r>
       <w:bookmarkEnd w:id="48"/>
     </w:p>
@@ -4725,59 +4982,291 @@
         <w:pStyle w:val="Compact"/>
       </w:pPr>
       <w:r>
-        <w:rPr>
-          <w:b/>
-        </w:rPr>
-        <w:t xml:space="preserve">Desktop Help menu:</w:t>
-      </w:r>
-      <w:r>
-        <w:t xml:space="preserve"> </w:t>
-      </w:r>
-      <w:r>
-        <w:rPr>
-          <w:b/>
-        </w:rPr>
-        <w:t xml:space="preserve">Help…</w:t>
-      </w:r>
-      <w:r>
-        <w:t xml:space="preserve"> </w:t>
-      </w:r>
-      <w:r>
-        <w:t xml:space="preserve">(plot types, how to format your data, privacy, the Publication-style disclaimer),</w:t>
-      </w:r>
-      <w:r>
-        <w:t xml:space="preserve"> </w:t>
-      </w:r>
-      <w:r>
-        <w:rPr>
-          <w:b/>
-        </w:rPr>
-        <w:t xml:space="preserve">About</w:t>
-      </w:r>
-      <w:r>
-        <w:t xml:space="preserve"> </w:t>
-      </w:r>
-      <w:r>
-        <w:t xml:space="preserve">(version),</w:t>
-      </w:r>
-      <w:r>
-        <w:t xml:space="preserve"> </w:t>
-      </w:r>
-      <w:r>
-        <w:rPr>
-          <w:b/>
-        </w:rPr>
-        <w:t xml:space="preserve">Copy debug info</w:t>
-      </w:r>
-      <w:r>
-        <w:t xml:space="preserve">.</w:t>
-      </w:r>
+        <w:t xml:space="preserve">Finalise the plot. 2.</w:t>
+      </w:r>
+      <w:r>
+        <w:t xml:space="preserve"> </w:t>
+      </w:r>
+      <w:r>
+        <w:rPr>
+          <w:b/>
+        </w:rPr>
+        <w:t xml:space="preserve">Save Figure Package</w:t>
+      </w:r>
+      <w:r>
+        <w:t xml:space="preserve">. 3. Send the one</w:t>
+      </w:r>
+      <w:r>
+        <w:t xml:space="preserve"> </w:t>
+      </w:r>
+      <w:r>
+        <w:rPr>
+          <w:rStyle w:val="VerbatimChar"/>
+        </w:rPr>
+        <w:t xml:space="preserve">.mmfpackage</w:t>
+      </w:r>
+      <w:r>
+        <w:t xml:space="preserve"> </w:t>
+      </w:r>
+      <w:r>
+        <w:t xml:space="preserve">file. 4. The collaborator opens Make My Figure. 5.</w:t>
+      </w:r>
+      <w:r>
+        <w:t xml:space="preserve"> </w:t>
+      </w:r>
+      <w:r>
+        <w:rPr>
+          <w:b/>
+        </w:rPr>
+        <w:t xml:space="preserve">Open Figure Package</w:t>
+      </w:r>
+      <w:r>
+        <w:t xml:space="preserve"> </w:t>
+      </w:r>
+      <w:r>
+        <w:t xml:space="preserve">(landing page or File menu). 6. Integrity is verified (every SHA-256). 7. The figure opens with the frozen data and configuration. 8. Inspect, edit and export as usual.</w:t>
+      </w:r>
+    </w:p>
+    <w:tbl>
+      <w:tblPr>
+        <w:tblStyle w:val="Table"/>
+        <w:tblW w:type="pct" w:w="5000.0"/>
+        <w:tblLook w:firstRow="1"/>
+      </w:tblPr>
+      <w:tblGrid>
+        <w:gridCol w:w="1980"/>
+        <w:gridCol w:w="1980"/>
+        <w:gridCol w:w="1980"/>
+        <w:gridCol w:w="1980"/>
+      </w:tblGrid>
+      <w:tr>
+        <w:trPr>
+          <w:cnfStyle w:firstRow="1"/>
+        </w:trPr>
+        <w:tc>
+          <w:tcPr>
+            <w:tcBorders>
+              <w:bottom w:val="single"/>
+            </w:tcBorders>
+            <w:vAlign w:val="bottom"/>
+          </w:tcPr>
+          <w:p/>
+        </w:tc>
+        <w:tc>
+          <w:tcPr>
+            <w:tcBorders>
+              <w:bottom w:val="single"/>
+            </w:tcBorders>
+            <w:vAlign w:val="bottom"/>
+          </w:tcPr>
+          <w:p>
+            <w:pPr>
+              <w:pStyle w:val="Compact"/>
+              <w:jc w:val="left"/>
+            </w:pPr>
+            <w:r>
+              <w:t xml:space="preserve">PlotSpec</w:t>
+            </w:r>
+          </w:p>
+        </w:tc>
+        <w:tc>
+          <w:tcPr>
+            <w:tcBorders>
+              <w:bottom w:val="single"/>
+            </w:tcBorders>
+            <w:vAlign w:val="bottom"/>
+          </w:tcPr>
+          <w:p>
+            <w:pPr>
+              <w:pStyle w:val="Compact"/>
+              <w:jc w:val="left"/>
+            </w:pPr>
+            <w:r>
+              <w:t xml:space="preserve">Figure preset</w:t>
+            </w:r>
+          </w:p>
+        </w:tc>
+        <w:tc>
+          <w:tcPr>
+            <w:tcBorders>
+              <w:bottom w:val="single"/>
+            </w:tcBorders>
+            <w:vAlign w:val="bottom"/>
+          </w:tcPr>
+          <w:p>
+            <w:pPr>
+              <w:pStyle w:val="Compact"/>
+              <w:jc w:val="left"/>
+            </w:pPr>
+            <w:r>
+              <w:t xml:space="preserve">Figure package</w:t>
+            </w:r>
+          </w:p>
+        </w:tc>
+      </w:tr>
+      <w:tr>
+        <w:tc>
+          <w:p>
+            <w:pPr>
+              <w:pStyle w:val="Compact"/>
+              <w:jc w:val="left"/>
+            </w:pPr>
+            <w:r>
+              <w:t xml:space="preserve">purpose</w:t>
+            </w:r>
+          </w:p>
+        </w:tc>
+        <w:tc>
+          <w:p>
+            <w:pPr>
+              <w:pStyle w:val="Compact"/>
+              <w:jc w:val="left"/>
+            </w:pPr>
+            <w:r>
+              <w:t xml:space="preserve">recipe for one plot</w:t>
+            </w:r>
+          </w:p>
+        </w:tc>
+        <w:tc>
+          <w:p>
+            <w:pPr>
+              <w:pStyle w:val="Compact"/>
+              <w:jc w:val="left"/>
+            </w:pPr>
+            <w:r>
+              <w:t xml:space="preserve">reusable configuration</w:t>
+            </w:r>
+          </w:p>
+        </w:tc>
+        <w:tc>
+          <w:p>
+            <w:pPr>
+              <w:pStyle w:val="Compact"/>
+              <w:jc w:val="left"/>
+            </w:pPr>
+            <w:r>
+              <w:t xml:space="preserve">portable reproducibility bundle</w:t>
+            </w:r>
+          </w:p>
+        </w:tc>
+      </w:tr>
+      <w:tr>
+        <w:tc>
+          <w:p>
+            <w:pPr>
+              <w:pStyle w:val="Compact"/>
+              <w:jc w:val="left"/>
+            </w:pPr>
+            <w:r>
+              <w:t xml:space="preserve">contains data</w:t>
+            </w:r>
+          </w:p>
+        </w:tc>
+        <w:tc>
+          <w:p>
+            <w:pPr>
+              <w:pStyle w:val="Compact"/>
+              <w:jc w:val="left"/>
+            </w:pPr>
+            <w:r>
+              <w:t xml:space="preserve">no — source data required</w:t>
+            </w:r>
+          </w:p>
+        </w:tc>
+        <w:tc>
+          <w:p>
+            <w:pPr>
+              <w:pStyle w:val="Compact"/>
+              <w:jc w:val="left"/>
+            </w:pPr>
+            <w:r>
+              <w:t xml:space="preserve">no</w:t>
+            </w:r>
+          </w:p>
+        </w:tc>
+        <w:tc>
+          <w:p>
+            <w:pPr>
+              <w:pStyle w:val="Compact"/>
+              <w:jc w:val="left"/>
+            </w:pPr>
+            <w:r>
+              <w:t xml:space="preserve">yes — frozen copy + specifications</w:t>
+            </w:r>
+          </w:p>
+        </w:tc>
+      </w:tr>
+      <w:tr>
+        <w:tc>
+          <w:p>
+            <w:pPr>
+              <w:pStyle w:val="Compact"/>
+              <w:jc w:val="left"/>
+            </w:pPr>
+            <w:r>
+              <w:t xml:space="preserve">file</w:t>
+            </w:r>
+          </w:p>
+        </w:tc>
+        <w:tc>
+          <w:p>
+            <w:pPr>
+              <w:pStyle w:val="Compact"/>
+              <w:jc w:val="left"/>
+            </w:pPr>
+            <w:r>
+              <w:rPr>
+                <w:rStyle w:val="VerbatimChar"/>
+              </w:rPr>
+              <w:t xml:space="preserve">.plot_spec.json</w:t>
+            </w:r>
+          </w:p>
+        </w:tc>
+        <w:tc>
+          <w:p>
+            <w:pPr>
+              <w:pStyle w:val="Compact"/>
+              <w:jc w:val="left"/>
+            </w:pPr>
+            <w:r>
+              <w:rPr>
+                <w:rStyle w:val="VerbatimChar"/>
+              </w:rPr>
+              <w:t xml:space="preserve">.mmfpreset.json</w:t>
+            </w:r>
+          </w:p>
+        </w:tc>
+        <w:tc>
+          <w:p>
+            <w:pPr>
+              <w:pStyle w:val="Compact"/>
+              <w:jc w:val="left"/>
+            </w:pPr>
+            <w:r>
+              <w:rPr>
+                <w:rStyle w:val="VerbatimChar"/>
+              </w:rPr>
+              <w:t xml:space="preserve">.mmfpackage</w:t>
+            </w:r>
+          </w:p>
+        </w:tc>
+      </w:tr>
+    </w:tbl>
+    <w:p>
+      <w:pPr>
+        <w:pStyle w:val="Heading2"/>
+      </w:pPr>
+      <w:bookmarkStart w:id="49" w:name="where-to-get-help"/>
+      <w:r>
+        <w:t xml:space="preserve">12. Where to get help</w:t>
+      </w:r>
+      <w:bookmarkEnd w:id="49"/>
     </w:p>
     <w:p>
       <w:pPr>
         <w:numPr>
           <w:ilvl w:val="0"/>
-          <w:numId w:val="1010"/>
+          <w:numId w:val="1011"/>
         </w:numPr>
         <w:pStyle w:val="Compact"/>
       </w:pPr>
@@ -4785,22 +5274,46 @@
         <w:rPr>
           <w:b/>
         </w:rPr>
-        <w:t xml:space="preserve">Browser sidebar:</w:t>
-      </w:r>
-      <w:r>
-        <w:t xml:space="preserve"> </w:t>
-      </w:r>
-      <w:r>
-        <w:t xml:space="preserve">the version banner and</w:t>
-      </w:r>
-      <w:r>
-        <w:t xml:space="preserve"> </w:t>
-      </w:r>
-      <w:r>
-        <w:rPr>
-          <w:b/>
-        </w:rPr>
-        <w:t xml:space="preserve">🔧 Diagnostics</w:t>
+        <w:t xml:space="preserve">Desktop Help menu:</w:t>
+      </w:r>
+      <w:r>
+        <w:t xml:space="preserve"> </w:t>
+      </w:r>
+      <w:r>
+        <w:rPr>
+          <w:b/>
+        </w:rPr>
+        <w:t xml:space="preserve">Help…</w:t>
+      </w:r>
+      <w:r>
+        <w:t xml:space="preserve"> </w:t>
+      </w:r>
+      <w:r>
+        <w:t xml:space="preserve">(plot types, how to format your data, privacy, the Publication-style disclaimer),</w:t>
+      </w:r>
+      <w:r>
+        <w:t xml:space="preserve"> </w:t>
+      </w:r>
+      <w:r>
+        <w:rPr>
+          <w:b/>
+        </w:rPr>
+        <w:t xml:space="preserve">About</w:t>
+      </w:r>
+      <w:r>
+        <w:t xml:space="preserve"> </w:t>
+      </w:r>
+      <w:r>
+        <w:t xml:space="preserve">(version),</w:t>
+      </w:r>
+      <w:r>
+        <w:t xml:space="preserve"> </w:t>
+      </w:r>
+      <w:r>
+        <w:rPr>
+          <w:b/>
+        </w:rPr>
+        <w:t xml:space="preserve">Copy debug info</w:t>
       </w:r>
       <w:r>
         <w:t xml:space="preserve">.</w:t>
@@ -4810,34 +5323,67 @@
       <w:pPr>
         <w:numPr>
           <w:ilvl w:val="0"/>
-          <w:numId w:val="1010"/>
+          <w:numId w:val="1011"/>
         </w:numPr>
         <w:pStyle w:val="Compact"/>
       </w:pPr>
       <w:r>
-        <w:t xml:space="preserve">The full</w:t>
-      </w:r>
-      <w:r>
-        <w:t xml:space="preserve"> </w:t>
-      </w:r>
-      <w:r>
-        <w:rPr>
-          <w:b/>
-        </w:rPr>
-        <w:t xml:space="preserve">User Manual</w:t>
-      </w:r>
-      <w:r>
-        <w:t xml:space="preserve"> </w:t>
-      </w:r>
-      <w:r>
-        <w:t xml:space="preserve">(this folder) documents every control, plot, statistic and file.</w:t>
+        <w:rPr>
+          <w:b/>
+        </w:rPr>
+        <w:t xml:space="preserve">Browser sidebar:</w:t>
+      </w:r>
+      <w:r>
+        <w:t xml:space="preserve"> </w:t>
+      </w:r>
+      <w:r>
+        <w:t xml:space="preserve">the version banner and</w:t>
+      </w:r>
+      <w:r>
+        <w:t xml:space="preserve"> </w:t>
+      </w:r>
+      <w:r>
+        <w:rPr>
+          <w:b/>
+        </w:rPr>
+        <w:t xml:space="preserve">🔧 Diagnostics</w:t>
+      </w:r>
+      <w:r>
+        <w:t xml:space="preserve">.</w:t>
       </w:r>
     </w:p>
     <w:p>
       <w:pPr>
         <w:numPr>
           <w:ilvl w:val="0"/>
-          <w:numId w:val="1010"/>
+          <w:numId w:val="1011"/>
+        </w:numPr>
+        <w:pStyle w:val="Compact"/>
+      </w:pPr>
+      <w:r>
+        <w:t xml:space="preserve">The full</w:t>
+      </w:r>
+      <w:r>
+        <w:t xml:space="preserve"> </w:t>
+      </w:r>
+      <w:r>
+        <w:rPr>
+          <w:b/>
+        </w:rPr>
+        <w:t xml:space="preserve">User Manual</w:t>
+      </w:r>
+      <w:r>
+        <w:t xml:space="preserve"> </w:t>
+      </w:r>
+      <w:r>
+        <w:t xml:space="preserve">(this folder) documents every control, plot, statistic and file.</w:t>
+      </w:r>
+    </w:p>
+    <w:p>
+      <w:pPr>
+        <w:numPr>
+          <w:ilvl w:val="0"/>
+          <w:numId w:val="1011"/>
         </w:numPr>
         <w:pStyle w:val="Compact"/>
       </w:pPr>
@@ -5494,6 +6040,36 @@
     <w:abstractNumId w:val="991"/>
   </w:num>
   <w:num w:numId="1010">
+    <w:abstractNumId w:val="99411"/>
+    <w:lvlOverride w:ilvl="0">
+      <w:startOverride w:val="1"/>
+    </w:lvlOverride>
+    <w:lvlOverride w:ilvl="1">
+      <w:startOverride w:val="1"/>
+    </w:lvlOverride>
+    <w:lvlOverride w:ilvl="2">
+      <w:startOverride w:val="1"/>
+    </w:lvlOverride>
+    <w:lvlOverride w:ilvl="3">
+      <w:startOverride w:val="1"/>
+    </w:lvlOverride>
+    <w:lvlOverride w:ilvl="4">
+      <w:startOverride w:val="1"/>
+    </w:lvlOverride>
+    <w:lvlOverride w:ilvl="5">
+      <w:startOverride w:val="1"/>
+    </w:lvlOverride>
+    <w:lvlOverride w:ilvl="6">
+      <w:startOverride w:val="1"/>
+    </w:lvlOverride>
+    <w:lvlOverride w:ilvl="7">
+      <w:startOverride w:val="1"/>
+    </w:lvlOverride>
+    <w:lvlOverride w:ilvl="8">
+      <w:startOverride w:val="1"/>
+    </w:lvlOverride>
+  </w:num>
+  <w:num w:numId="1011">
     <w:abstractNumId w:val="991"/>
   </w:num>
 </w:numbering>

</xml_diff>

<commit_message>
Prepare v1.1.1: version bump, changelog section, release notes, README, manuals and QC artefacts
- make_my_figure_core/version.py -> 1.1.1 (single source; pyproject, apps and manuals read it)
- CHANGELOG: the v1.1.1 candidate block, the Circos chord diagram, the pandas 3 compatibility fixes
  and the packaging/dependency bullets consolidated under [1.1.1]; Unreleased emptied
- docs/RELEASE_NOTES_v1.1.1.md; README badge, download table, banner, wheel name and citation;
  requirements-lock header; manual sources reference the v1.1.1 artefact names
- regenerated: plot catalogue (39 sections), manual diagrams, Quick Start and User Manual
  (MD/DOCX/PDF, version banner 1.1.1), figure-preset QC matrix (39/39 PASS)

No tag, no build, no GitHub release: those follow the author's final check.

Co-Authored-By: Claude Fable 5.1 <noreply@anthropic.com>
</commit_message>
<xml_diff>
--- a/docs/manuals/Quick_Start/MakeMyFigure_Quick_Start.docx
+++ b/docs/manuals/Quick_Start/MakeMyFigure_Quick_Start.docx
@@ -52,7 +52,7 @@
         <w:t xml:space="preserve"> </w:t>
       </w:r>
       <w:r>
-        <w:t xml:space="preserve">1.1.0</w:t>
+        <w:t xml:space="preserve">1.1.1</w:t>
       </w:r>
       <w:r>
         <w:br/>
@@ -70,7 +70,7 @@
         <w:rPr>
           <w:rStyle w:val="VerbatimChar"/>
         </w:rPr>
-        <w:t xml:space="preserve">473d495</w:t>
+        <w:t xml:space="preserve">15b6b40</w:t>
       </w:r>
       <w:r>
         <w:br/>
@@ -85,7 +85,7 @@
         <w:t xml:space="preserve"> </w:t>
       </w:r>
       <w:r>
-        <w:t xml:space="preserve">2026-09-11</w:t>
+        <w:t xml:space="preserve">2026-09-20</w:t>
       </w:r>
     </w:p>
     <w:p>
@@ -518,7 +518,7 @@
         <w:rPr>
           <w:b/>
         </w:rPr>
-        <w:t xml:space="preserve">v1.1.0</w:t>
+        <w:t xml:space="preserve">v1.1.1</w:t>
       </w:r>
       <w:r>
         <w:t xml:space="preserve">):</w:t>
@@ -616,7 +616,7 @@
               <w:rPr>
                 <w:rStyle w:val="VerbatimChar"/>
               </w:rPr>
-              <w:t xml:space="preserve">MakeMyFigure-1.1.0.dmg</w:t>
+              <w:t xml:space="preserve">MakeMyFigure-1.1.1.dmg</w:t>
             </w:r>
           </w:p>
         </w:tc>
@@ -711,7 +711,7 @@
               <w:rPr>
                 <w:rStyle w:val="VerbatimChar"/>
               </w:rPr>
-              <w:t xml:space="preserve">MakeMyFigure-1.1.0-Setup.exe</w:t>
+              <w:t xml:space="preserve">MakeMyFigure-1.1.1-Setup.exe</w:t>
             </w:r>
             <w:r>
               <w:t xml:space="preserve"> </w:t>
@@ -726,7 +726,7 @@
               <w:rPr>
                 <w:rStyle w:val="VerbatimChar"/>
               </w:rPr>
-              <w:t xml:space="preserve">MakeMyFigure-1.1.0-windows.zip</w:t>
+              <w:t xml:space="preserve">MakeMyFigure-1.1.1-windows.zip</w:t>
             </w:r>
             <w:r>
               <w:t xml:space="preserve">)</w:t>
@@ -797,7 +797,7 @@
               <w:rPr>
                 <w:rStyle w:val="VerbatimChar"/>
               </w:rPr>
-              <w:t xml:space="preserve">MakeMyFigure-1.1.0.AppImage</w:t>
+              <w:t xml:space="preserve">MakeMyFigure-1.1.1.AppImage</w:t>
             </w:r>
             <w:r>
               <w:t xml:space="preserve"> </w:t>
@@ -812,7 +812,7 @@
               <w:rPr>
                 <w:rStyle w:val="VerbatimChar"/>
               </w:rPr>
-              <w:t xml:space="preserve">MakeMyFigure-1.1.0-linux.tar.gz</w:t>
+              <w:t xml:space="preserve">MakeMyFigure-1.1.1-linux.tar.gz</w:t>
             </w:r>
             <w:r>
               <w:t xml:space="preserve">)</w:t>
@@ -829,7 +829,7 @@
               <w:rPr>
                 <w:rStyle w:val="VerbatimChar"/>
               </w:rPr>
-              <w:t xml:space="preserve">chmod +x MakeMyFigure-1.1.0.AppImage &amp;&amp; ./MakeMyFigure-1.1.0.AppImage</w:t>
+              <w:t xml:space="preserve">chmod +x MakeMyFigure-1.1.1.AppImage &amp;&amp; ./MakeMyFigure-1.1.1.AppImage</w:t>
             </w:r>
             <w:r>
               <w:t xml:space="preserve">, or unpack the tarball and run</w:t>
@@ -917,7 +917,7 @@
         <w:rPr>
           <w:rStyle w:val="VerbatimChar"/>
         </w:rPr>
-        <w:t xml:space="preserve">Make My Figure v1.1.0 · &lt;commit&gt; · &lt;platform&gt; · &lt;backend&gt;</w:t>
+        <w:t xml:space="preserve">Make My Figure v1.1.1 · &lt;commit&gt; · &lt;platform&gt; · &lt;backend&gt;</w:t>
       </w:r>
       <w:r>
         <w:t xml:space="preserve"> </w:t>

</xml_diff>

<commit_message>
Rebuild the manual PDF and DOCX for v1.3.1
User Manual 82 -> 85 pages (Part XXVIII: experimental tables, log axes,
factorial ANOVA and coefficients, with screenshots), 6.8 -> 7.5 MB; Quick
Start 14 pages, unchanged content. Built with scripts/build_manuals.py
(pandoc 3.9, PyMuPDF). The Markdown banners are committed with the
version bump.

Co-Authored-By: Claude Opus 5.5 <noreply@anthropic.com>
</commit_message>
<xml_diff>
--- a/docs/manuals/Quick_Start/MakeMyFigure_Quick_Start.docx
+++ b/docs/manuals/Quick_Start/MakeMyFigure_Quick_Start.docx
@@ -52,7 +52,7 @@
         <w:t xml:space="preserve"> </w:t>
       </w:r>
       <w:r>
-        <w:t xml:space="preserve">1.2.1</w:t>
+        <w:t xml:space="preserve">1.3.1</w:t>
       </w:r>
       <w:r>
         <w:br/>
@@ -71,7 +71,7 @@
         <w:rPr>
           <w:rStyle w:val="VerbatimChar"/>
         </w:rPr>
-        <w:t xml:space="preserve">d110866</w:t>
+        <w:t xml:space="preserve">765c260</w:t>
       </w:r>
       <w:r>
         <w:br/>
@@ -87,7 +87,7 @@
         <w:t xml:space="preserve"> </w:t>
       </w:r>
       <w:r>
-        <w:t xml:space="preserve">2026-10-06</w:t>
+        <w:t xml:space="preserve">2026-10-14</w:t>
       </w:r>
     </w:p>
     <w:p>

</xml_diff>

<commit_message>
Rebuild the manual PDF and DOCX for v1.3.2
User Manual 85 -> 86 pages, 78 figures: Part XXVIII gains sections 83-85
(assumption checks before a parametric test, residual plots, the R-style
statistics report) beside 81 facet grids and 82 wide tables. Quick Start
14 pages, content unchanged. Built with scripts/build_manuals.py (pandoc
from pypandoc, PyMuPDF). The Markdown banners are committed with the
version bump.

Co-Authored-By: Claude Opus 5.5 <noreply@anthropic.com>
</commit_message>
<xml_diff>
--- a/docs/manuals/Quick_Start/MakeMyFigure_Quick_Start.docx
+++ b/docs/manuals/Quick_Start/MakeMyFigure_Quick_Start.docx
@@ -52,7 +52,7 @@
         <w:t xml:space="preserve"> </w:t>
       </w:r>
       <w:r>
-        <w:t xml:space="preserve">1.3.1</w:t>
+        <w:t xml:space="preserve">1.3.2</w:t>
       </w:r>
       <w:r>
         <w:br/>
@@ -71,7 +71,7 @@
         <w:rPr>
           <w:rStyle w:val="VerbatimChar"/>
         </w:rPr>
-        <w:t xml:space="preserve">765c260</w:t>
+        <w:t xml:space="preserve">7841f0e</w:t>
       </w:r>
       <w:r>
         <w:br/>
@@ -87,7 +87,7 @@
         <w:t xml:space="preserve"> </w:t>
       </w:r>
       <w:r>
-        <w:t xml:space="preserve">2026-10-14</w:t>
+        <w:t xml:space="preserve">2026-10-19</w:t>
       </w:r>
     </w:p>
     <w:p>

</xml_diff>